<commit_message>
feat: plantillas oficiales actualizadas (sin notas de elaboracion) y generador del supervisor tolerante a notas borradas
- informe-lider.docx e informe-supervisor.docx reemplazados por las versiones editadas por el usuario
- plantillaSupervisor: el cronograma y los adjuntos ya no dependen de las notas de la plantilla; admite parrafos vacios autocerrados

Co-Authored-By: Claude Sonnet 5 <noreply@anthropic.com>
</commit_message>
<xml_diff>
--- a/app/vinculacion/informes/_templates/informe-supervisor.docx
+++ b/app/vinculacion/informes/_templates/informe-supervisor.docx
@@ -1,15 +1,15 @@
 
 <file path=word/document.xml><?xml version="1.0" encoding="utf-8"?>
-<w:document xmlns:wpc="http://schemas.microsoft.com/office/word/2010/wordprocessingCanvas" xmlns:cx="http://schemas.microsoft.com/office/drawing/2014/chartex" xmlns:cx1="http://schemas.microsoft.com/office/drawing/2015/9/8/chartex" xmlns:cx2="http://schemas.microsoft.com/office/drawing/2015/10/21/chartex" xmlns:cx3="http://schemas.microsoft.com/office/drawing/2016/5/9/chartex" xmlns:cx4="http://schemas.microsoft.com/office/drawing/2016/5/10/chartex" xmlns:cx5="http://schemas.microsoft.com/office/drawing/2016/5/11/chartex" xmlns:cx6="http://schemas.microsoft.com/office/drawing/2016/5/12/chartex" xmlns:cx7="http://schemas.microsoft.com/office/drawing/2016/5/13/chartex" xmlns:cx8="http://schemas.microsoft.com/office/drawing/2016/5/14/chartex" xmlns:mc="http://schemas.openxmlformats.org/markup-compatibility/2006" xmlns:aink="http://schemas.microsoft.com/office/drawing/2016/ink" xmlns:am3d="http://schemas.microsoft.com/office/drawing/2017/model3d" xmlns:o="urn:schemas-microsoft-com:office:office" xmlns:oel="http://schemas.microsoft.com/office/2019/extlst" xmlns:r="http://schemas.openxmlformats.org/officeDocument/2006/relationships" xmlns:m="http://schemas.openxmlformats.org/officeDocument/2006/math" xmlns:v="urn:schemas-microsoft-com:vml" xmlns:wp14="http://schemas.microsoft.com/office/word/2010/wordprocessingDrawing" xmlns:wp="http://schemas.openxmlformats.org/drawingml/2006/wordprocessingDrawing" xmlns:w10="urn:schemas-microsoft-com:office:word" xmlns:w="http://schemas.openxmlformats.org/wordprocessingml/2006/main" xmlns:w14="http://schemas.microsoft.com/office/word/2010/wordml" xmlns:w15="http://schemas.microsoft.com/office/word/2012/wordml" xmlns:w16cex="http://schemas.microsoft.com/office/word/2018/wordml/cex" xmlns:w16cid="http://schemas.microsoft.com/office/word/2016/wordml/cid" xmlns:w16="http://schemas.microsoft.com/office/word/2018/wordml" xmlns:w16du="http://schemas.microsoft.com/office/word/2023/wordml/word16du" xmlns:w16sdtdh="http://schemas.microsoft.com/office/word/2020/wordml/sdtdatahash" xmlns:w16se="http://schemas.microsoft.com/office/word/2015/wordml/symex" xmlns:wpg="http://schemas.microsoft.com/office/word/2010/wordprocessingGroup" xmlns:wpi="http://schemas.microsoft.com/office/word/2010/wordprocessingInk" xmlns:wne="http://schemas.microsoft.com/office/word/2006/wordml" xmlns:wps="http://schemas.microsoft.com/office/word/2010/wordprocessingShape" mc:Ignorable="w14 w15 w16se w16cid w16 w16cex w16sdtdh wp14">
+<w:document xmlns:wpc="http://schemas.microsoft.com/office/word/2010/wordprocessingCanvas" xmlns:cx="http://schemas.microsoft.com/office/drawing/2014/chartex" xmlns:cx1="http://schemas.microsoft.com/office/drawing/2015/9/8/chartex" xmlns:cx2="http://schemas.microsoft.com/office/drawing/2015/10/21/chartex" xmlns:cx3="http://schemas.microsoft.com/office/drawing/2016/5/9/chartex" xmlns:cx4="http://schemas.microsoft.com/office/drawing/2016/5/10/chartex" xmlns:cx5="http://schemas.microsoft.com/office/drawing/2016/5/11/chartex" xmlns:cx6="http://schemas.microsoft.com/office/drawing/2016/5/12/chartex" xmlns:cx7="http://schemas.microsoft.com/office/drawing/2016/5/13/chartex" xmlns:cx8="http://schemas.microsoft.com/office/drawing/2016/5/14/chartex" xmlns:mc="http://schemas.openxmlformats.org/markup-compatibility/2006" xmlns:aink="http://schemas.microsoft.com/office/drawing/2016/ink" xmlns:am3d="http://schemas.microsoft.com/office/drawing/2017/model3d" xmlns:o="urn:schemas-microsoft-com:office:office" xmlns:oel="http://schemas.microsoft.com/office/2019/extlst" xmlns:r="http://schemas.openxmlformats.org/officeDocument/2006/relationships" xmlns:m="http://schemas.openxmlformats.org/officeDocument/2006/math" xmlns:v="urn:schemas-microsoft-com:vml" xmlns:wp14="http://schemas.microsoft.com/office/word/2010/wordprocessingDrawing" xmlns:wp="http://schemas.openxmlformats.org/drawingml/2006/wordprocessingDrawing" xmlns:w10="urn:schemas-microsoft-com:office:word" xmlns:w="http://schemas.openxmlformats.org/wordprocessingml/2006/main" xmlns:w14="http://schemas.microsoft.com/office/word/2010/wordml" xmlns:w15="http://schemas.microsoft.com/office/word/2012/wordml" xmlns:w16cex="http://schemas.microsoft.com/office/word/2018/wordml/cex" xmlns:w16cid="http://schemas.microsoft.com/office/word/2016/wordml/cid" xmlns:w16="http://schemas.microsoft.com/office/word/2018/wordml" xmlns:w16du="http://schemas.microsoft.com/office/word/2023/wordml/word16du" xmlns:w16sdtdh="http://schemas.microsoft.com/office/word/2020/wordml/sdtdatahash" xmlns:w16sdtfl="http://schemas.microsoft.com/office/word/2024/wordml/sdtformatlock" xmlns:w16se="http://schemas.microsoft.com/office/word/2015/wordml/symex" xmlns:wpg="http://schemas.microsoft.com/office/word/2010/wordprocessingGroup" xmlns:wpi="http://schemas.microsoft.com/office/word/2010/wordprocessingInk" xmlns:wne="http://schemas.microsoft.com/office/word/2006/wordml" xmlns:wps="http://schemas.microsoft.com/office/word/2010/wordprocessingShape" mc:Ignorable="w14 w15 w16se w16cid w16 w16cex w16sdtdh w16sdtfl w16du wp14">
   <w:body>
     <w:p>
       <w:pPr>
         <w:spacing w:after="0" w:line="240" w:lineRule="auto"/>
         <w:jc w:val="center"/>
         <w:rPr>
-          <w:rFonts w:eastAsia="Times New Roman" w:cs="Calibri" w:cstheme="minorAscii"/>
-          <w:b w:val="1"/>
-          <w:bCs w:val="1"/>
+          <w:rFonts w:eastAsia="Times New Roman"/>
+          <w:b/>
+          <w:bCs/>
           <w:sz w:val="24"/>
           <w:szCs w:val="24"/>
           <w:lang w:eastAsia="es-ES"/>
@@ -17,9 +17,9 @@
       </w:pPr>
       <w:r>
         <w:rPr>
-          <w:rFonts w:eastAsia="Times New Roman" w:cs="Calibri" w:cstheme="minorAscii"/>
-          <w:b w:val="1"/>
-          <w:bCs w:val="1"/>
+          <w:rFonts w:eastAsia="Times New Roman"/>
+          <w:b/>
+          <w:bCs/>
           <w:sz w:val="24"/>
           <w:szCs w:val="24"/>
           <w:lang w:eastAsia="es-ES"/>
@@ -28,9 +28,9 @@
       </w:r>
       <w:r>
         <w:rPr>
-          <w:rFonts w:eastAsia="Times New Roman" w:cs="Calibri" w:cstheme="minorAscii"/>
-          <w:b w:val="1"/>
-          <w:bCs w:val="1"/>
+          <w:rFonts w:eastAsia="Times New Roman"/>
+          <w:b/>
+          <w:bCs/>
           <w:sz w:val="24"/>
           <w:szCs w:val="24"/>
           <w:lang w:eastAsia="es-ES"/>
@@ -39,9 +39,9 @@
       </w:r>
       <w:r>
         <w:rPr>
-          <w:rFonts w:eastAsia="Times New Roman" w:cs="Calibri" w:cstheme="minorAscii"/>
-          <w:b w:val="1"/>
-          <w:bCs w:val="1"/>
+          <w:rFonts w:eastAsia="Times New Roman"/>
+          <w:b/>
+          <w:bCs/>
           <w:sz w:val="24"/>
           <w:szCs w:val="24"/>
           <w:lang w:eastAsia="es-ES"/>
@@ -569,130 +569,13 @@
         <w:tc>
           <w:tcPr>
             <w:tcW w:w="9782" w:type="dxa"/>
-            <w:shd w:val="clear" w:color="auto" w:fill="auto"/>
           </w:tcPr>
           <w:p>
             <w:pPr>
               <w:pStyle w:val="Ttulo2"/>
               <w:rPr>
-                <w:rFonts w:asciiTheme="minorHAnsi" w:hAnsiTheme="minorHAnsi" w:cstheme="minorHAnsi"/>
+                <w:rFonts w:cstheme="minorHAnsi"/>
                 <w:b w:val="0"/>
-                <w:bCs w:val="0"/>
-                <w:i/>
-                <w:iCs/>
-                <w:color w:val="BFBFBF" w:themeColor="background1" w:themeShade="BF"/>
-              </w:rPr>
-            </w:pPr>
-            <w:r>
-              <w:rPr>
-                <w:rFonts w:asciiTheme="minorHAnsi" w:hAnsiTheme="minorHAnsi" w:cstheme="minorHAnsi"/>
-                <w:b w:val="0"/>
-                <w:bCs w:val="0"/>
-                <w:i/>
-                <w:iCs/>
-                <w:color w:val="BFBFBF" w:themeColor="background1" w:themeShade="BF"/>
-              </w:rPr>
-              <w:t>C</w:t>
-            </w:r>
-            <w:r>
-              <w:rPr>
-                <w:rFonts w:asciiTheme="minorHAnsi" w:hAnsiTheme="minorHAnsi" w:cstheme="minorHAnsi"/>
-                <w:b w:val="0"/>
-                <w:bCs w:val="0"/>
-                <w:i/>
-                <w:iCs/>
-                <w:color w:val="BFBFBF" w:themeColor="background1" w:themeShade="BF"/>
-              </w:rPr>
-              <w:t xml:space="preserve">ronograma </w:t>
-            </w:r>
-            <w:r>
-              <w:rPr>
-                <w:rFonts w:asciiTheme="minorHAnsi" w:hAnsiTheme="minorHAnsi" w:cstheme="minorHAnsi"/>
-                <w:b w:val="0"/>
-                <w:bCs w:val="0"/>
-                <w:i/>
-                <w:iCs/>
-                <w:color w:val="BFBFBF" w:themeColor="background1" w:themeShade="BF"/>
-              </w:rPr>
-              <w:t>de actividades-tareas asignadas a supervisar</w:t>
-            </w:r>
-            <w:r>
-              <w:rPr>
-                <w:rFonts w:asciiTheme="minorHAnsi" w:hAnsiTheme="minorHAnsi" w:cstheme="minorHAnsi"/>
-                <w:b w:val="0"/>
-                <w:bCs w:val="0"/>
-                <w:i/>
-                <w:iCs/>
-                <w:color w:val="BFBFBF" w:themeColor="background1" w:themeShade="BF"/>
-              </w:rPr>
-              <w:t xml:space="preserve">. Señalar con </w:t>
-            </w:r>
-            <w:r>
-              <w:rPr>
-                <w:rFonts w:asciiTheme="minorHAnsi" w:hAnsiTheme="minorHAnsi" w:cstheme="minorHAnsi"/>
-                <w:b w:val="0"/>
-                <w:bCs w:val="0"/>
-                <w:i/>
-                <w:iCs/>
-                <w:color w:val="BFBFBF" w:themeColor="background1" w:themeShade="BF"/>
-                <w:u w:val="single"/>
-              </w:rPr>
-              <w:t>distinto</w:t>
-            </w:r>
-            <w:r>
-              <w:rPr>
-                <w:rFonts w:asciiTheme="minorHAnsi" w:hAnsiTheme="minorHAnsi" w:cstheme="minorHAnsi"/>
-                <w:b w:val="0"/>
-                <w:bCs w:val="0"/>
-                <w:i/>
-                <w:iCs/>
-                <w:color w:val="BFBFBF" w:themeColor="background1" w:themeShade="BF"/>
-              </w:rPr>
-              <w:t xml:space="preserve">s </w:t>
-            </w:r>
-            <w:r>
-              <w:rPr>
-                <w:rFonts w:asciiTheme="minorHAnsi" w:hAnsiTheme="minorHAnsi" w:cstheme="minorHAnsi"/>
-                <w:b w:val="0"/>
-                <w:bCs w:val="0"/>
-                <w:i/>
-                <w:iCs/>
-                <w:color w:val="BFBFBF" w:themeColor="background1" w:themeShade="BF"/>
-              </w:rPr>
-              <w:t xml:space="preserve">  </w:t>
-            </w:r>
-            <w:r>
-              <w:rPr>
-                <w:rFonts w:asciiTheme="minorHAnsi" w:hAnsiTheme="minorHAnsi" w:cstheme="minorHAnsi"/>
-                <w:b w:val="0"/>
-                <w:bCs w:val="0"/>
-                <w:i/>
-                <w:iCs/>
-                <w:color w:val="BFBFBF" w:themeColor="background1" w:themeShade="BF"/>
-              </w:rPr>
-              <w:t>colores aquellas actividades que se han realizado</w:t>
-            </w:r>
-            <w:r>
-              <w:rPr>
-                <w:rFonts w:asciiTheme="minorHAnsi" w:hAnsiTheme="minorHAnsi" w:cstheme="minorHAnsi"/>
-                <w:b w:val="0"/>
-                <w:bCs w:val="0"/>
-                <w:i/>
-                <w:iCs/>
-                <w:color w:val="BFBFBF" w:themeColor="background1" w:themeShade="BF"/>
-              </w:rPr>
-              <w:t>.</w:t>
-            </w:r>
-          </w:p>
-          <w:p>
-            <w:pPr>
-              <w:ind w:left="708" w:hanging="356"/>
-              <w:rPr>
-                <w:rFonts w:eastAsia="Times New Roman" w:cstheme="minorHAnsi"/>
-                <w:b/>
-                <w:sz w:val="24"/>
-                <w:szCs w:val="24"/>
-                <w:lang w:eastAsia="es-ES"/>
               </w:rPr>
             </w:pPr>
           </w:p>
@@ -839,7 +722,6 @@
               </w:rPr>
             </w:pPr>
             <w:proofErr w:type="spellStart"/>
-            <w:proofErr w:type="gramStart"/>
             <w:r>
               <w:rPr>
                 <w:rFonts w:eastAsia="Times New Roman" w:cstheme="minorHAnsi"/>
@@ -851,7 +733,6 @@
               <w:t>No.alumnos</w:t>
             </w:r>
             <w:proofErr w:type="spellEnd"/>
-            <w:proofErr w:type="gramEnd"/>
             <w:r>
               <w:rPr>
                 <w:rFonts w:eastAsia="Times New Roman" w:cstheme="minorHAnsi"/>
@@ -1566,6 +1447,7 @@
                 <w:b/>
                 <w:bCs/>
               </w:rPr>
+              <w:lastRenderedPageBreak/>
               <w:t>Actividades no previstas inicialmente que han sido realizadas o a incorporar durante la ejecución del proyecto</w:t>
             </w:r>
           </w:p>
@@ -1651,7 +1533,6 @@
               </w:rPr>
             </w:pPr>
             <w:proofErr w:type="spellStart"/>
-            <w:proofErr w:type="gramStart"/>
             <w:r>
               <w:rPr>
                 <w:rFonts w:eastAsia="Times New Roman" w:cstheme="minorHAnsi"/>
@@ -1663,7 +1544,6 @@
               <w:t>No.alumnos</w:t>
             </w:r>
             <w:proofErr w:type="spellEnd"/>
-            <w:proofErr w:type="gramEnd"/>
             <w:r>
               <w:rPr>
                 <w:rFonts w:eastAsia="Times New Roman" w:cstheme="minorHAnsi"/>
@@ -2420,38 +2300,6 @@
               </w:rPr>
             </w:pPr>
           </w:p>
-          <w:p>
-            <w:pPr>
-              <w:rPr>
-                <w:rFonts w:cstheme="minorHAnsi"/>
-                <w:b/>
-                <w:color w:val="BFBFBF" w:themeColor="background1" w:themeShade="BF"/>
-                <w:sz w:val="24"/>
-                <w:szCs w:val="24"/>
-              </w:rPr>
-            </w:pPr>
-            <w:r>
-              <w:rPr>
-                <w:rFonts w:cstheme="minorHAnsi"/>
-                <w:b/>
-                <w:color w:val="BFBFBF" w:themeColor="background1" w:themeShade="BF"/>
-                <w:sz w:val="24"/>
-                <w:szCs w:val="24"/>
-              </w:rPr>
-              <w:t>Estadísticas por grupos de alumnos, ubicar un ejemplo</w:t>
-            </w:r>
-          </w:p>
-          <w:p>
-            <w:pPr>
-              <w:rPr>
-                <w:rFonts w:cstheme="minorHAnsi"/>
-                <w:b/>
-                <w:color w:val="000000"/>
-                <w:sz w:val="24"/>
-                <w:szCs w:val="24"/>
-              </w:rPr>
-            </w:pPr>
-          </w:p>
         </w:tc>
       </w:tr>
       <w:tr>
@@ -2523,51 +2371,6 @@
           <w:tcPr>
             <w:tcW w:w="9782" w:type="dxa"/>
           </w:tcPr>
-          <w:p>
-            <w:pPr>
-              <w:rPr>
-                <w:rFonts w:cstheme="minorHAnsi"/>
-                <w:b/>
-                <w:color w:val="000000"/>
-                <w:sz w:val="24"/>
-                <w:szCs w:val="24"/>
-              </w:rPr>
-            </w:pPr>
-          </w:p>
-          <w:p>
-            <w:pPr>
-              <w:rPr>
-                <w:rFonts w:eastAsia="Times New Roman" w:cstheme="minorHAnsi"/>
-                <w:b/>
-                <w:color w:val="BFBFBF" w:themeColor="background1" w:themeShade="BF"/>
-                <w:sz w:val="24"/>
-                <w:szCs w:val="24"/>
-                <w:lang w:eastAsia="es-ES"/>
-              </w:rPr>
-            </w:pPr>
-            <w:r>
-              <w:rPr>
-                <w:rFonts w:eastAsia="Times New Roman" w:cstheme="minorHAnsi"/>
-                <w:b/>
-                <w:color w:val="BFBFBF" w:themeColor="background1" w:themeShade="BF"/>
-                <w:sz w:val="24"/>
-                <w:szCs w:val="24"/>
-                <w:lang w:eastAsia="es-ES"/>
-              </w:rPr>
-              <w:t>Participación de beneficiarios directos e indirectos</w:t>
-            </w:r>
-            <w:r>
-              <w:rPr>
-                <w:rFonts w:eastAsia="Times New Roman" w:cstheme="minorHAnsi"/>
-                <w:b/>
-                <w:color w:val="BFBFBF" w:themeColor="background1" w:themeShade="BF"/>
-                <w:sz w:val="24"/>
-                <w:szCs w:val="24"/>
-                <w:lang w:eastAsia="es-ES"/>
-              </w:rPr>
-              <w:t xml:space="preserve"> por sexo</w:t>
-            </w:r>
-          </w:p>
           <w:p>
             <w:pPr>
               <w:rPr>
@@ -2892,57 +2695,6 @@
                 <w:szCs w:val="24"/>
               </w:rPr>
             </w:pPr>
-          </w:p>
-          <w:p>
-            <w:pPr>
-              <w:rPr>
-                <w:rFonts w:cstheme="minorHAnsi"/>
-                <w:bCs/>
-                <w:color w:val="BFBFBF" w:themeColor="background1" w:themeShade="BF"/>
-                <w:sz w:val="24"/>
-                <w:szCs w:val="24"/>
-              </w:rPr>
-            </w:pPr>
-            <w:r>
-              <w:rPr>
-                <w:rFonts w:cstheme="minorHAnsi"/>
-                <w:bCs/>
-                <w:color w:val="BFBFBF" w:themeColor="background1" w:themeShade="BF"/>
-                <w:sz w:val="24"/>
-                <w:szCs w:val="24"/>
-              </w:rPr>
-              <w:t xml:space="preserve">Evidencias </w:t>
-            </w:r>
-            <w:r>
-              <w:rPr>
-                <w:rFonts w:cstheme="minorHAnsi"/>
-                <w:bCs/>
-                <w:color w:val="BFBFBF" w:themeColor="background1" w:themeShade="BF"/>
-                <w:sz w:val="24"/>
-                <w:szCs w:val="24"/>
-              </w:rPr>
-              <w:t xml:space="preserve">sólo relevantes </w:t>
-            </w:r>
-            <w:r>
-              <w:rPr>
-                <w:rFonts w:cstheme="minorHAnsi"/>
-                <w:bCs/>
-                <w:color w:val="BFBFBF" w:themeColor="background1" w:themeShade="BF"/>
-                <w:sz w:val="24"/>
-                <w:szCs w:val="24"/>
-              </w:rPr>
-              <w:t>de las actividades-tareas realizadas</w:t>
-            </w:r>
-            <w:r>
-              <w:rPr>
-                <w:rFonts w:cstheme="minorHAnsi"/>
-                <w:bCs/>
-                <w:color w:val="BFBFBF" w:themeColor="background1" w:themeShade="BF"/>
-                <w:sz w:val="24"/>
-                <w:szCs w:val="24"/>
-              </w:rPr>
-              <w:t>.</w:t>
-            </w:r>
           </w:p>
           <w:p>
             <w:pPr>
@@ -3016,12 +2768,6 @@
           <w:b/>
         </w:rPr>
         <w:tab/>
-      </w:r>
-      <w:r>
-        <w:rPr>
-          <w:rFonts w:cstheme="minorHAnsi"/>
-          <w:b/>
-        </w:rPr>
         <w:t xml:space="preserve">     _________________________________</w:t>
       </w:r>
     </w:p>
@@ -3073,21 +2819,15 @@
           <w:b/>
         </w:rPr>
         <w:tab/>
+        <w:t xml:space="preserve">     Líder del Proyecto de Vinculación</w:t>
       </w:r>
-      <w:r>
+    </w:p>
+    <w:p>
+      <w:pPr>
         <w:rPr>
           <w:rFonts w:cstheme="minorHAnsi"/>
           <w:b/>
         </w:rPr>
-        <w:t xml:space="preserve">     Líder del Proyecto de Vinculación</w:t>
-      </w:r>
-    </w:p>
-    <w:p>
-      <w:pPr>
-        <w:rPr>
-          <w:rFonts w:cstheme="minorHAnsi"/>
-          <w:b/>
-        </w:rPr>
       </w:pPr>
     </w:p>
     <w:p>
@@ -3101,7 +2841,7 @@
     <w:sectPr>
       <w:headerReference w:type="default" r:id="rId11"/>
       <w:footerReference w:type="default" r:id="rId12"/>
-      <w:pgSz w:w="12240" w:h="15840" w:orient="portrait"/>
+      <w:pgSz w:w="12240" w:h="15840"/>
       <w:pgMar w:top="1417" w:right="1701" w:bottom="1417" w:left="1701" w:header="6" w:footer="709" w:gutter="0"/>
       <w:cols w:space="708"/>
       <w:docGrid w:linePitch="360"/>
@@ -3111,7 +2851,7 @@
 </file>
 
 <file path=word/endnotes.xml><?xml version="1.0" encoding="utf-8"?>
-<w:endnotes xmlns:wpc="http://schemas.microsoft.com/office/word/2010/wordprocessingCanvas" xmlns:cx="http://schemas.microsoft.com/office/drawing/2014/chartex" xmlns:cx1="http://schemas.microsoft.com/office/drawing/2015/9/8/chartex" xmlns:cx2="http://schemas.microsoft.com/office/drawing/2015/10/21/chartex" xmlns:cx3="http://schemas.microsoft.com/office/drawing/2016/5/9/chartex" xmlns:cx4="http://schemas.microsoft.com/office/drawing/2016/5/10/chartex" xmlns:cx5="http://schemas.microsoft.com/office/drawing/2016/5/11/chartex" xmlns:cx6="http://schemas.microsoft.com/office/drawing/2016/5/12/chartex" xmlns:cx7="http://schemas.microsoft.com/office/drawing/2016/5/13/chartex" xmlns:cx8="http://schemas.microsoft.com/office/drawing/2016/5/14/chartex" xmlns:mc="http://schemas.openxmlformats.org/markup-compatibility/2006" xmlns:aink="http://schemas.microsoft.com/office/drawing/2016/ink" xmlns:am3d="http://schemas.microsoft.com/office/drawing/2017/model3d" xmlns:o="urn:schemas-microsoft-com:office:office" xmlns:oel="http://schemas.microsoft.com/office/2019/extlst" xmlns:r="http://schemas.openxmlformats.org/officeDocument/2006/relationships" xmlns:m="http://schemas.openxmlformats.org/officeDocument/2006/math" xmlns:v="urn:schemas-microsoft-com:vml" xmlns:wp14="http://schemas.microsoft.com/office/word/2010/wordprocessingDrawing" xmlns:wp="http://schemas.openxmlformats.org/drawingml/2006/wordprocessingDrawing" xmlns:w10="urn:schemas-microsoft-com:office:word" xmlns:w="http://schemas.openxmlformats.org/wordprocessingml/2006/main" xmlns:w14="http://schemas.microsoft.com/office/word/2010/wordml" xmlns:w15="http://schemas.microsoft.com/office/word/2012/wordml" xmlns:w16cex="http://schemas.microsoft.com/office/word/2018/wordml/cex" xmlns:w16cid="http://schemas.microsoft.com/office/word/2016/wordml/cid" xmlns:w16="http://schemas.microsoft.com/office/word/2018/wordml" xmlns:w16du="http://schemas.microsoft.com/office/word/2023/wordml/word16du" xmlns:w16sdtdh="http://schemas.microsoft.com/office/word/2020/wordml/sdtdatahash" xmlns:w16se="http://schemas.microsoft.com/office/word/2015/wordml/symex" xmlns:wpg="http://schemas.microsoft.com/office/word/2010/wordprocessingGroup" xmlns:wpi="http://schemas.microsoft.com/office/word/2010/wordprocessingInk" xmlns:wne="http://schemas.microsoft.com/office/word/2006/wordml" xmlns:wps="http://schemas.microsoft.com/office/word/2010/wordprocessingShape" mc:Ignorable="w14 w15 w16se w16cid w16 w16cex w16sdtdh wp14">
+<w:endnotes xmlns:wpc="http://schemas.microsoft.com/office/word/2010/wordprocessingCanvas" xmlns:cx="http://schemas.microsoft.com/office/drawing/2014/chartex" xmlns:cx1="http://schemas.microsoft.com/office/drawing/2015/9/8/chartex" xmlns:cx2="http://schemas.microsoft.com/office/drawing/2015/10/21/chartex" xmlns:cx3="http://schemas.microsoft.com/office/drawing/2016/5/9/chartex" xmlns:cx4="http://schemas.microsoft.com/office/drawing/2016/5/10/chartex" xmlns:cx5="http://schemas.microsoft.com/office/drawing/2016/5/11/chartex" xmlns:cx6="http://schemas.microsoft.com/office/drawing/2016/5/12/chartex" xmlns:cx7="http://schemas.microsoft.com/office/drawing/2016/5/13/chartex" xmlns:cx8="http://schemas.microsoft.com/office/drawing/2016/5/14/chartex" xmlns:mc="http://schemas.openxmlformats.org/markup-compatibility/2006" xmlns:aink="http://schemas.microsoft.com/office/drawing/2016/ink" xmlns:am3d="http://schemas.microsoft.com/office/drawing/2017/model3d" xmlns:o="urn:schemas-microsoft-com:office:office" xmlns:oel="http://schemas.microsoft.com/office/2019/extlst" xmlns:r="http://schemas.openxmlformats.org/officeDocument/2006/relationships" xmlns:m="http://schemas.openxmlformats.org/officeDocument/2006/math" xmlns:v="urn:schemas-microsoft-com:vml" xmlns:wp14="http://schemas.microsoft.com/office/word/2010/wordprocessingDrawing" xmlns:wp="http://schemas.openxmlformats.org/drawingml/2006/wordprocessingDrawing" xmlns:w10="urn:schemas-microsoft-com:office:word" xmlns:w="http://schemas.openxmlformats.org/wordprocessingml/2006/main" xmlns:w14="http://schemas.microsoft.com/office/word/2010/wordml" xmlns:w15="http://schemas.microsoft.com/office/word/2012/wordml" xmlns:w16cex="http://schemas.microsoft.com/office/word/2018/wordml/cex" xmlns:w16cid="http://schemas.microsoft.com/office/word/2016/wordml/cid" xmlns:w16="http://schemas.microsoft.com/office/word/2018/wordml" xmlns:w16du="http://schemas.microsoft.com/office/word/2023/wordml/word16du" xmlns:w16sdtdh="http://schemas.microsoft.com/office/word/2020/wordml/sdtdatahash" xmlns:w16sdtfl="http://schemas.microsoft.com/office/word/2024/wordml/sdtformatlock" xmlns:w16se="http://schemas.microsoft.com/office/word/2015/wordml/symex" xmlns:wpg="http://schemas.microsoft.com/office/word/2010/wordprocessingGroup" xmlns:wpi="http://schemas.microsoft.com/office/word/2010/wordprocessingInk" xmlns:wne="http://schemas.microsoft.com/office/word/2006/wordml" xmlns:wps="http://schemas.microsoft.com/office/word/2010/wordprocessingShape" mc:Ignorable="w14 w15 w16se w16cid w16 w16cex w16sdtdh w16sdtfl w16du wp14">
   <w:endnote w:type="separator" w:id="-1">
     <w:p>
       <w:pPr>
@@ -3136,7 +2876,7 @@
 </file>
 
 <file path=word/footer1.xml><?xml version="1.0" encoding="utf-8"?>
-<w:ftr xmlns:wpc="http://schemas.microsoft.com/office/word/2010/wordprocessingCanvas" xmlns:cx="http://schemas.microsoft.com/office/drawing/2014/chartex" xmlns:cx1="http://schemas.microsoft.com/office/drawing/2015/9/8/chartex" xmlns:cx2="http://schemas.microsoft.com/office/drawing/2015/10/21/chartex" xmlns:cx3="http://schemas.microsoft.com/office/drawing/2016/5/9/chartex" xmlns:cx4="http://schemas.microsoft.com/office/drawing/2016/5/10/chartex" xmlns:cx5="http://schemas.microsoft.com/office/drawing/2016/5/11/chartex" xmlns:cx6="http://schemas.microsoft.com/office/drawing/2016/5/12/chartex" xmlns:cx7="http://schemas.microsoft.com/office/drawing/2016/5/13/chartex" xmlns:cx8="http://schemas.microsoft.com/office/drawing/2016/5/14/chartex" xmlns:mc="http://schemas.openxmlformats.org/markup-compatibility/2006" xmlns:aink="http://schemas.microsoft.com/office/drawing/2016/ink" xmlns:am3d="http://schemas.microsoft.com/office/drawing/2017/model3d" xmlns:o="urn:schemas-microsoft-com:office:office" xmlns:oel="http://schemas.microsoft.com/office/2019/extlst" xmlns:r="http://schemas.openxmlformats.org/officeDocument/2006/relationships" xmlns:m="http://schemas.openxmlformats.org/officeDocument/2006/math" xmlns:v="urn:schemas-microsoft-com:vml" xmlns:wp14="http://schemas.microsoft.com/office/word/2010/wordprocessingDrawing" xmlns:wp="http://schemas.openxmlformats.org/drawingml/2006/wordprocessingDrawing" xmlns:w10="urn:schemas-microsoft-com:office:word" xmlns:w="http://schemas.openxmlformats.org/wordprocessingml/2006/main" xmlns:w14="http://schemas.microsoft.com/office/word/2010/wordml" xmlns:w15="http://schemas.microsoft.com/office/word/2012/wordml" xmlns:w16cex="http://schemas.microsoft.com/office/word/2018/wordml/cex" xmlns:w16cid="http://schemas.microsoft.com/office/word/2016/wordml/cid" xmlns:w16="http://schemas.microsoft.com/office/word/2018/wordml" xmlns:w16du="http://schemas.microsoft.com/office/word/2023/wordml/word16du" xmlns:w16sdtdh="http://schemas.microsoft.com/office/word/2020/wordml/sdtdatahash" xmlns:w16se="http://schemas.microsoft.com/office/word/2015/wordml/symex" xmlns:wpg="http://schemas.microsoft.com/office/word/2010/wordprocessingGroup" xmlns:wpi="http://schemas.microsoft.com/office/word/2010/wordprocessingInk" xmlns:wne="http://schemas.microsoft.com/office/word/2006/wordml" xmlns:wps="http://schemas.microsoft.com/office/word/2010/wordprocessingShape" xmlns:a="http://schemas.openxmlformats.org/drawingml/2006/main" mc:Ignorable="w14 w15 w16se w16cid w16 w16cex w16sdtdh wp14">
+<w:ftr xmlns:wpc="http://schemas.microsoft.com/office/word/2010/wordprocessingCanvas" xmlns:cx="http://schemas.microsoft.com/office/drawing/2014/chartex" xmlns:cx1="http://schemas.microsoft.com/office/drawing/2015/9/8/chartex" xmlns:cx2="http://schemas.microsoft.com/office/drawing/2015/10/21/chartex" xmlns:cx3="http://schemas.microsoft.com/office/drawing/2016/5/9/chartex" xmlns:cx4="http://schemas.microsoft.com/office/drawing/2016/5/10/chartex" xmlns:cx5="http://schemas.microsoft.com/office/drawing/2016/5/11/chartex" xmlns:cx6="http://schemas.microsoft.com/office/drawing/2016/5/12/chartex" xmlns:cx7="http://schemas.microsoft.com/office/drawing/2016/5/13/chartex" xmlns:cx8="http://schemas.microsoft.com/office/drawing/2016/5/14/chartex" xmlns:mc="http://schemas.openxmlformats.org/markup-compatibility/2006" xmlns:aink="http://schemas.microsoft.com/office/drawing/2016/ink" xmlns:am3d="http://schemas.microsoft.com/office/drawing/2017/model3d" xmlns:o="urn:schemas-microsoft-com:office:office" xmlns:oel="http://schemas.microsoft.com/office/2019/extlst" xmlns:r="http://schemas.openxmlformats.org/officeDocument/2006/relationships" xmlns:m="http://schemas.openxmlformats.org/officeDocument/2006/math" xmlns:v="urn:schemas-microsoft-com:vml" xmlns:wp14="http://schemas.microsoft.com/office/word/2010/wordprocessingDrawing" xmlns:wp="http://schemas.openxmlformats.org/drawingml/2006/wordprocessingDrawing" xmlns:w10="urn:schemas-microsoft-com:office:word" xmlns:w="http://schemas.openxmlformats.org/wordprocessingml/2006/main" xmlns:w14="http://schemas.microsoft.com/office/word/2010/wordml" xmlns:w15="http://schemas.microsoft.com/office/word/2012/wordml" xmlns:w16cex="http://schemas.microsoft.com/office/word/2018/wordml/cex" xmlns:w16cid="http://schemas.microsoft.com/office/word/2016/wordml/cid" xmlns:w16="http://schemas.microsoft.com/office/word/2018/wordml" xmlns:w16du="http://schemas.microsoft.com/office/word/2023/wordml/word16du" xmlns:w16sdtdh="http://schemas.microsoft.com/office/word/2020/wordml/sdtdatahash" xmlns:w16sdtfl="http://schemas.microsoft.com/office/word/2024/wordml/sdtformatlock" xmlns:w16se="http://schemas.microsoft.com/office/word/2015/wordml/symex" xmlns:wpg="http://schemas.microsoft.com/office/word/2010/wordprocessingGroup" xmlns:wpi="http://schemas.microsoft.com/office/word/2010/wordprocessingInk" xmlns:wne="http://schemas.microsoft.com/office/word/2006/wordml" xmlns:wps="http://schemas.microsoft.com/office/word/2010/wordprocessingShape" mc:Ignorable="w14 w15 w16se w16cid w16 w16cex w16sdtdh w16sdtfl w16du wp14">
   <w:p>
     <w:pPr>
       <w:ind w:right="260"/>
@@ -3377,7 +3117,7 @@
 </file>
 
 <file path=word/footnotes.xml><?xml version="1.0" encoding="utf-8"?>
-<w:footnotes xmlns:wpc="http://schemas.microsoft.com/office/word/2010/wordprocessingCanvas" xmlns:cx="http://schemas.microsoft.com/office/drawing/2014/chartex" xmlns:cx1="http://schemas.microsoft.com/office/drawing/2015/9/8/chartex" xmlns:cx2="http://schemas.microsoft.com/office/drawing/2015/10/21/chartex" xmlns:cx3="http://schemas.microsoft.com/office/drawing/2016/5/9/chartex" xmlns:cx4="http://schemas.microsoft.com/office/drawing/2016/5/10/chartex" xmlns:cx5="http://schemas.microsoft.com/office/drawing/2016/5/11/chartex" xmlns:cx6="http://schemas.microsoft.com/office/drawing/2016/5/12/chartex" xmlns:cx7="http://schemas.microsoft.com/office/drawing/2016/5/13/chartex" xmlns:cx8="http://schemas.microsoft.com/office/drawing/2016/5/14/chartex" xmlns:mc="http://schemas.openxmlformats.org/markup-compatibility/2006" xmlns:aink="http://schemas.microsoft.com/office/drawing/2016/ink" xmlns:am3d="http://schemas.microsoft.com/office/drawing/2017/model3d" xmlns:o="urn:schemas-microsoft-com:office:office" xmlns:oel="http://schemas.microsoft.com/office/2019/extlst" xmlns:r="http://schemas.openxmlformats.org/officeDocument/2006/relationships" xmlns:m="http://schemas.openxmlformats.org/officeDocument/2006/math" xmlns:v="urn:schemas-microsoft-com:vml" xmlns:wp14="http://schemas.microsoft.com/office/word/2010/wordprocessingDrawing" xmlns:wp="http://schemas.openxmlformats.org/drawingml/2006/wordprocessingDrawing" xmlns:w10="urn:schemas-microsoft-com:office:word" xmlns:w="http://schemas.openxmlformats.org/wordprocessingml/2006/main" xmlns:w14="http://schemas.microsoft.com/office/word/2010/wordml" xmlns:w15="http://schemas.microsoft.com/office/word/2012/wordml" xmlns:w16cex="http://schemas.microsoft.com/office/word/2018/wordml/cex" xmlns:w16cid="http://schemas.microsoft.com/office/word/2016/wordml/cid" xmlns:w16="http://schemas.microsoft.com/office/word/2018/wordml" xmlns:w16du="http://schemas.microsoft.com/office/word/2023/wordml/word16du" xmlns:w16sdtdh="http://schemas.microsoft.com/office/word/2020/wordml/sdtdatahash" xmlns:w16se="http://schemas.microsoft.com/office/word/2015/wordml/symex" xmlns:wpg="http://schemas.microsoft.com/office/word/2010/wordprocessingGroup" xmlns:wpi="http://schemas.microsoft.com/office/word/2010/wordprocessingInk" xmlns:wne="http://schemas.microsoft.com/office/word/2006/wordml" xmlns:wps="http://schemas.microsoft.com/office/word/2010/wordprocessingShape" mc:Ignorable="w14 w15 w16se w16cid w16 w16cex w16sdtdh wp14">
+<w:footnotes xmlns:wpc="http://schemas.microsoft.com/office/word/2010/wordprocessingCanvas" xmlns:cx="http://schemas.microsoft.com/office/drawing/2014/chartex" xmlns:cx1="http://schemas.microsoft.com/office/drawing/2015/9/8/chartex" xmlns:cx2="http://schemas.microsoft.com/office/drawing/2015/10/21/chartex" xmlns:cx3="http://schemas.microsoft.com/office/drawing/2016/5/9/chartex" xmlns:cx4="http://schemas.microsoft.com/office/drawing/2016/5/10/chartex" xmlns:cx5="http://schemas.microsoft.com/office/drawing/2016/5/11/chartex" xmlns:cx6="http://schemas.microsoft.com/office/drawing/2016/5/12/chartex" xmlns:cx7="http://schemas.microsoft.com/office/drawing/2016/5/13/chartex" xmlns:cx8="http://schemas.microsoft.com/office/drawing/2016/5/14/chartex" xmlns:mc="http://schemas.openxmlformats.org/markup-compatibility/2006" xmlns:aink="http://schemas.microsoft.com/office/drawing/2016/ink" xmlns:am3d="http://schemas.microsoft.com/office/drawing/2017/model3d" xmlns:o="urn:schemas-microsoft-com:office:office" xmlns:oel="http://schemas.microsoft.com/office/2019/extlst" xmlns:r="http://schemas.openxmlformats.org/officeDocument/2006/relationships" xmlns:m="http://schemas.openxmlformats.org/officeDocument/2006/math" xmlns:v="urn:schemas-microsoft-com:vml" xmlns:wp14="http://schemas.microsoft.com/office/word/2010/wordprocessingDrawing" xmlns:wp="http://schemas.openxmlformats.org/drawingml/2006/wordprocessingDrawing" xmlns:w10="urn:schemas-microsoft-com:office:word" xmlns:w="http://schemas.openxmlformats.org/wordprocessingml/2006/main" xmlns:w14="http://schemas.microsoft.com/office/word/2010/wordml" xmlns:w15="http://schemas.microsoft.com/office/word/2012/wordml" xmlns:w16cex="http://schemas.microsoft.com/office/word/2018/wordml/cex" xmlns:w16cid="http://schemas.microsoft.com/office/word/2016/wordml/cid" xmlns:w16="http://schemas.microsoft.com/office/word/2018/wordml" xmlns:w16du="http://schemas.microsoft.com/office/word/2023/wordml/word16du" xmlns:w16sdtdh="http://schemas.microsoft.com/office/word/2020/wordml/sdtdatahash" xmlns:w16sdtfl="http://schemas.microsoft.com/office/word/2024/wordml/sdtformatlock" xmlns:w16se="http://schemas.microsoft.com/office/word/2015/wordml/symex" xmlns:wpg="http://schemas.microsoft.com/office/word/2010/wordprocessingGroup" xmlns:wpi="http://schemas.microsoft.com/office/word/2010/wordprocessingInk" xmlns:wne="http://schemas.microsoft.com/office/word/2006/wordml" xmlns:wps="http://schemas.microsoft.com/office/word/2010/wordprocessingShape" mc:Ignorable="w14 w15 w16se w16cid w16 w16cex w16sdtdh w16sdtfl w16du wp14">
   <w:footnote w:type="separator" w:id="-1">
     <w:p>
       <w:pPr>
@@ -3402,7 +3142,7 @@
 </file>
 
 <file path=word/header1.xml><?xml version="1.0" encoding="utf-8"?>
-<w:hdr xmlns:wpc="http://schemas.microsoft.com/office/word/2010/wordprocessingCanvas" xmlns:cx="http://schemas.microsoft.com/office/drawing/2014/chartex" xmlns:cx1="http://schemas.microsoft.com/office/drawing/2015/9/8/chartex" xmlns:cx2="http://schemas.microsoft.com/office/drawing/2015/10/21/chartex" xmlns:cx3="http://schemas.microsoft.com/office/drawing/2016/5/9/chartex" xmlns:cx4="http://schemas.microsoft.com/office/drawing/2016/5/10/chartex" xmlns:cx5="http://schemas.microsoft.com/office/drawing/2016/5/11/chartex" xmlns:cx6="http://schemas.microsoft.com/office/drawing/2016/5/12/chartex" xmlns:cx7="http://schemas.microsoft.com/office/drawing/2016/5/13/chartex" xmlns:cx8="http://schemas.microsoft.com/office/drawing/2016/5/14/chartex" xmlns:mc="http://schemas.openxmlformats.org/markup-compatibility/2006" xmlns:aink="http://schemas.microsoft.com/office/drawing/2016/ink" xmlns:am3d="http://schemas.microsoft.com/office/drawing/2017/model3d" xmlns:o="urn:schemas-microsoft-com:office:office" xmlns:oel="http://schemas.microsoft.com/office/2019/extlst" xmlns:r="http://schemas.openxmlformats.org/officeDocument/2006/relationships" xmlns:m="http://schemas.openxmlformats.org/officeDocument/2006/math" xmlns:v="urn:schemas-microsoft-com:vml" xmlns:wp14="http://schemas.microsoft.com/office/word/2010/wordprocessingDrawing" xmlns:wp="http://schemas.openxmlformats.org/drawingml/2006/wordprocessingDrawing" xmlns:w10="urn:schemas-microsoft-com:office:word" xmlns:w="http://schemas.openxmlformats.org/wordprocessingml/2006/main" xmlns:w14="http://schemas.microsoft.com/office/word/2010/wordml" xmlns:w15="http://schemas.microsoft.com/office/word/2012/wordml" xmlns:w16cex="http://schemas.microsoft.com/office/word/2018/wordml/cex" xmlns:w16cid="http://schemas.microsoft.com/office/word/2016/wordml/cid" xmlns:w16="http://schemas.microsoft.com/office/word/2018/wordml" xmlns:w16du="http://schemas.microsoft.com/office/word/2023/wordml/word16du" xmlns:w16sdtdh="http://schemas.microsoft.com/office/word/2020/wordml/sdtdatahash" xmlns:w16se="http://schemas.microsoft.com/office/word/2015/wordml/symex" xmlns:wpg="http://schemas.microsoft.com/office/word/2010/wordprocessingGroup" xmlns:wpi="http://schemas.microsoft.com/office/word/2010/wordprocessingInk" xmlns:wne="http://schemas.microsoft.com/office/word/2006/wordml" xmlns:wps="http://schemas.microsoft.com/office/word/2010/wordprocessingShape" xmlns:a="http://schemas.openxmlformats.org/drawingml/2006/main" xmlns:pic="http://schemas.openxmlformats.org/drawingml/2006/picture" xmlns:a14="http://schemas.microsoft.com/office/drawing/2010/main" mc:Ignorable="w14 w15 w16se w16cid w16 w16cex w16sdtdh wp14">
+<w:hdr xmlns:wpc="http://schemas.microsoft.com/office/word/2010/wordprocessingCanvas" xmlns:cx="http://schemas.microsoft.com/office/drawing/2014/chartex" xmlns:cx1="http://schemas.microsoft.com/office/drawing/2015/9/8/chartex" xmlns:cx2="http://schemas.microsoft.com/office/drawing/2015/10/21/chartex" xmlns:cx3="http://schemas.microsoft.com/office/drawing/2016/5/9/chartex" xmlns:cx4="http://schemas.microsoft.com/office/drawing/2016/5/10/chartex" xmlns:cx5="http://schemas.microsoft.com/office/drawing/2016/5/11/chartex" xmlns:cx6="http://schemas.microsoft.com/office/drawing/2016/5/12/chartex" xmlns:cx7="http://schemas.microsoft.com/office/drawing/2016/5/13/chartex" xmlns:cx8="http://schemas.microsoft.com/office/drawing/2016/5/14/chartex" xmlns:mc="http://schemas.openxmlformats.org/markup-compatibility/2006" xmlns:aink="http://schemas.microsoft.com/office/drawing/2016/ink" xmlns:am3d="http://schemas.microsoft.com/office/drawing/2017/model3d" xmlns:o="urn:schemas-microsoft-com:office:office" xmlns:oel="http://schemas.microsoft.com/office/2019/extlst" xmlns:r="http://schemas.openxmlformats.org/officeDocument/2006/relationships" xmlns:m="http://schemas.openxmlformats.org/officeDocument/2006/math" xmlns:v="urn:schemas-microsoft-com:vml" xmlns:wp14="http://schemas.microsoft.com/office/word/2010/wordprocessingDrawing" xmlns:wp="http://schemas.openxmlformats.org/drawingml/2006/wordprocessingDrawing" xmlns:w10="urn:schemas-microsoft-com:office:word" xmlns:w="http://schemas.openxmlformats.org/wordprocessingml/2006/main" xmlns:w14="http://schemas.microsoft.com/office/word/2010/wordml" xmlns:w15="http://schemas.microsoft.com/office/word/2012/wordml" xmlns:w16cex="http://schemas.microsoft.com/office/word/2018/wordml/cex" xmlns:w16cid="http://schemas.microsoft.com/office/word/2016/wordml/cid" xmlns:w16="http://schemas.microsoft.com/office/word/2018/wordml" xmlns:w16du="http://schemas.microsoft.com/office/word/2023/wordml/word16du" xmlns:w16sdtdh="http://schemas.microsoft.com/office/word/2020/wordml/sdtdatahash" xmlns:w16sdtfl="http://schemas.microsoft.com/office/word/2024/wordml/sdtformatlock" xmlns:w16se="http://schemas.microsoft.com/office/word/2015/wordml/symex" xmlns:wpg="http://schemas.microsoft.com/office/word/2010/wordprocessingGroup" xmlns:wpi="http://schemas.microsoft.com/office/word/2010/wordprocessingInk" xmlns:wne="http://schemas.microsoft.com/office/word/2006/wordml" xmlns:wps="http://schemas.microsoft.com/office/word/2010/wordprocessingShape" mc:Ignorable="w14 w15 w16se w16cid w16 w16cex w16sdtdh w16sdtfl w16du wp14">
   <w:p>
     <w:pPr>
       <w:pStyle w:val="Encabezado"/>
@@ -3515,7 +3255,7 @@
           <w:pPr>
             <w:pStyle w:val="Encabezado"/>
             <w:rPr>
-              <w:rFonts w:ascii="Arial" w:hAnsi="Arial" w:eastAsia="Calibri" w:cs="Arial"/>
+              <w:rFonts w:ascii="Arial" w:eastAsia="Calibri" w:hAnsi="Arial" w:cs="Arial"/>
               <w:b/>
               <w:sz w:val="18"/>
               <w:szCs w:val="18"/>
@@ -3524,7 +3264,7 @@
           </w:pPr>
           <w:r>
             <w:rPr>
-              <w:rFonts w:ascii="Arial" w:hAnsi="Arial" w:eastAsia="Calibri" w:cs="Arial"/>
+              <w:rFonts w:ascii="Arial" w:eastAsia="Calibri" w:hAnsi="Arial" w:cs="Arial"/>
               <w:b/>
               <w:sz w:val="18"/>
               <w:szCs w:val="18"/>
@@ -3537,7 +3277,7 @@
           <w:pPr>
             <w:jc w:val="center"/>
             <w:rPr>
-              <w:rFonts w:ascii="Arial" w:hAnsi="Arial" w:eastAsia="Times New Roman" w:cs="Arial"/>
+              <w:rFonts w:ascii="Arial" w:eastAsia="Times New Roman" w:hAnsi="Arial" w:cs="Arial"/>
               <w:b/>
               <w:sz w:val="18"/>
               <w:szCs w:val="18"/>
@@ -3546,7 +3286,7 @@
           </w:pPr>
           <w:r>
             <w:rPr>
-              <w:rFonts w:ascii="Arial" w:hAnsi="Arial" w:eastAsia="Times New Roman" w:cs="Arial"/>
+              <w:rFonts w:ascii="Arial" w:eastAsia="Times New Roman" w:hAnsi="Arial" w:cs="Arial"/>
               <w:b/>
               <w:sz w:val="18"/>
               <w:szCs w:val="18"/>
@@ -3556,7 +3296,7 @@
           </w:r>
           <w:r>
             <w:rPr>
-              <w:rFonts w:ascii="Arial" w:hAnsi="Arial" w:eastAsia="Times New Roman" w:cs="Arial"/>
+              <w:rFonts w:ascii="Arial" w:eastAsia="Times New Roman" w:hAnsi="Arial" w:cs="Arial"/>
               <w:b/>
               <w:sz w:val="18"/>
               <w:szCs w:val="18"/>
@@ -3566,7 +3306,7 @@
           </w:r>
           <w:r>
             <w:rPr>
-              <w:rFonts w:ascii="Arial" w:hAnsi="Arial" w:eastAsia="Times New Roman" w:cs="Arial"/>
+              <w:rFonts w:ascii="Arial" w:eastAsia="Times New Roman" w:hAnsi="Arial" w:cs="Arial"/>
               <w:b/>
               <w:sz w:val="18"/>
               <w:szCs w:val="18"/>
@@ -3590,7 +3330,7 @@
           </w:pPr>
           <w:r>
             <w:rPr>
-              <w:rFonts w:ascii="Arial" w:hAnsi="Arial" w:eastAsia="Calibri" w:cs="Arial"/>
+              <w:rFonts w:ascii="Arial" w:eastAsia="Calibri" w:hAnsi="Arial" w:cs="Arial"/>
               <w:b/>
               <w:sz w:val="18"/>
               <w:szCs w:val="18"/>
@@ -3629,7 +3369,7 @@
           <w:pPr>
             <w:suppressAutoHyphens/>
             <w:rPr>
-              <w:rFonts w:ascii="Arial" w:hAnsi="Arial" w:eastAsia="Calibri" w:cs="Arial"/>
+              <w:rFonts w:ascii="Arial" w:eastAsia="Calibri" w:hAnsi="Arial" w:cs="Arial"/>
               <w:b/>
               <w:sz w:val="18"/>
               <w:szCs w:val="18"/>
@@ -3638,7 +3378,7 @@
           </w:pPr>
           <w:r>
             <w:rPr>
-              <w:rFonts w:ascii="Arial" w:hAnsi="Arial" w:eastAsia="Calibri" w:cs="Arial"/>
+              <w:rFonts w:ascii="Arial" w:eastAsia="Calibri" w:hAnsi="Arial" w:cs="Arial"/>
               <w:b/>
               <w:sz w:val="18"/>
               <w:szCs w:val="18"/>
@@ -3652,7 +3392,7 @@
             <w:suppressAutoHyphens/>
             <w:jc w:val="center"/>
             <w:rPr>
-              <w:rFonts w:ascii="Arial" w:hAnsi="Arial" w:eastAsia="Calibri" w:cs="Arial"/>
+              <w:rFonts w:ascii="Arial" w:eastAsia="Calibri" w:hAnsi="Arial" w:cs="Arial"/>
               <w:b/>
               <w:sz w:val="18"/>
               <w:szCs w:val="18"/>
@@ -3661,7 +3401,7 @@
           </w:pPr>
           <w:r>
             <w:rPr>
-              <w:rFonts w:ascii="Arial" w:hAnsi="Arial" w:eastAsia="Calibri" w:cs="Arial"/>
+              <w:rFonts w:ascii="Arial" w:eastAsia="Calibri" w:hAnsi="Arial" w:cs="Arial"/>
               <w:b/>
               <w:sz w:val="18"/>
               <w:szCs w:val="18"/>
@@ -3671,7 +3411,7 @@
           </w:r>
           <w:r>
             <w:rPr>
-              <w:rFonts w:ascii="Arial" w:hAnsi="Arial" w:eastAsia="Calibri" w:cs="Arial"/>
+              <w:rFonts w:ascii="Arial" w:eastAsia="Calibri" w:hAnsi="Arial" w:cs="Arial"/>
               <w:b/>
               <w:sz w:val="18"/>
               <w:szCs w:val="18"/>
@@ -3695,7 +3435,7 @@
           </w:pPr>
           <w:r>
             <w:rPr>
-              <w:rFonts w:ascii="Arial" w:hAnsi="Arial" w:eastAsia="Calibri" w:cs="Arial"/>
+              <w:rFonts w:ascii="Arial" w:eastAsia="Calibri" w:hAnsi="Arial" w:cs="Arial"/>
               <w:b/>
               <w:sz w:val="18"/>
               <w:szCs w:val="18"/>
@@ -3748,7 +3488,7 @@
           <w:pPr>
             <w:suppressAutoHyphens/>
             <w:rPr>
-              <w:rFonts w:ascii="Arial" w:hAnsi="Arial" w:eastAsia="Calibri" w:cs="Arial"/>
+              <w:rFonts w:ascii="Arial" w:eastAsia="Calibri" w:hAnsi="Arial" w:cs="Arial"/>
               <w:sz w:val="18"/>
               <w:szCs w:val="18"/>
               <w:lang w:val="es-ES" w:eastAsia="ar-SA"/>
@@ -3756,7 +3496,7 @@
           </w:pPr>
           <w:r>
             <w:rPr>
-              <w:rFonts w:ascii="Arial" w:hAnsi="Arial" w:eastAsia="Calibri" w:cs="Arial"/>
+              <w:rFonts w:ascii="Arial" w:eastAsia="Calibri" w:hAnsi="Arial" w:cs="Arial"/>
               <w:sz w:val="18"/>
               <w:szCs w:val="18"/>
               <w:lang w:val="es-ES" w:eastAsia="ar-SA"/>
@@ -3765,7 +3505,7 @@
           </w:r>
           <w:r>
             <w:rPr>
-              <w:rFonts w:ascii="Arial" w:hAnsi="Arial" w:eastAsia="Calibri" w:cs="Arial"/>
+              <w:rFonts w:ascii="Arial" w:eastAsia="Calibri" w:hAnsi="Arial" w:cs="Arial"/>
               <w:sz w:val="18"/>
               <w:szCs w:val="18"/>
               <w:lang w:val="es-ES" w:eastAsia="ar-SA"/>
@@ -3774,7 +3514,7 @@
           </w:r>
           <w:r>
             <w:rPr>
-              <w:rFonts w:ascii="Arial" w:hAnsi="Arial" w:eastAsia="Calibri" w:cs="Arial"/>
+              <w:rFonts w:ascii="Arial" w:eastAsia="Calibri" w:hAnsi="Arial" w:cs="Arial"/>
               <w:sz w:val="18"/>
               <w:szCs w:val="18"/>
               <w:lang w:val="es-ES" w:eastAsia="ar-SA"/>
@@ -3783,7 +3523,7 @@
           </w:r>
           <w:r>
             <w:rPr>
-              <w:rFonts w:ascii="Arial" w:hAnsi="Arial" w:eastAsia="Calibri" w:cs="Arial"/>
+              <w:rFonts w:ascii="Arial" w:eastAsia="Calibri" w:hAnsi="Arial" w:cs="Arial"/>
               <w:sz w:val="18"/>
               <w:szCs w:val="18"/>
               <w:lang w:val="es-ES" w:eastAsia="ar-SA"/>
@@ -3792,7 +3532,7 @@
           </w:r>
           <w:r>
             <w:rPr>
-              <w:rFonts w:ascii="Arial" w:hAnsi="Arial" w:eastAsia="Calibri" w:cs="Arial"/>
+              <w:rFonts w:ascii="Arial" w:eastAsia="Calibri" w:hAnsi="Arial" w:cs="Arial"/>
               <w:noProof/>
               <w:sz w:val="18"/>
               <w:szCs w:val="18"/>
@@ -3802,7 +3542,7 @@
           </w:r>
           <w:r>
             <w:rPr>
-              <w:rFonts w:ascii="Arial" w:hAnsi="Arial" w:eastAsia="Calibri" w:cs="Arial"/>
+              <w:rFonts w:ascii="Arial" w:eastAsia="Calibri" w:hAnsi="Arial" w:cs="Arial"/>
               <w:sz w:val="18"/>
               <w:szCs w:val="18"/>
               <w:lang w:val="es-ES" w:eastAsia="ar-SA"/>
@@ -3811,7 +3551,7 @@
           </w:r>
           <w:r>
             <w:rPr>
-              <w:rFonts w:ascii="Arial" w:hAnsi="Arial" w:eastAsia="Calibri" w:cs="Arial"/>
+              <w:rFonts w:ascii="Arial" w:eastAsia="Calibri" w:hAnsi="Arial" w:cs="Arial"/>
               <w:sz w:val="18"/>
               <w:szCs w:val="18"/>
               <w:lang w:val="es-ES" w:eastAsia="ar-SA"/>
@@ -3831,7 +3571,7 @@
 </file>
 
 <file path=word/numbering.xml><?xml version="1.0" encoding="utf-8"?>
-<w:numbering xmlns:wpc="http://schemas.microsoft.com/office/word/2010/wordprocessingCanvas" xmlns:cx="http://schemas.microsoft.com/office/drawing/2014/chartex" xmlns:cx1="http://schemas.microsoft.com/office/drawing/2015/9/8/chartex" xmlns:cx2="http://schemas.microsoft.com/office/drawing/2015/10/21/chartex" xmlns:cx3="http://schemas.microsoft.com/office/drawing/2016/5/9/chartex" xmlns:cx4="http://schemas.microsoft.com/office/drawing/2016/5/10/chartex" xmlns:cx5="http://schemas.microsoft.com/office/drawing/2016/5/11/chartex" xmlns:cx6="http://schemas.microsoft.com/office/drawing/2016/5/12/chartex" xmlns:cx7="http://schemas.microsoft.com/office/drawing/2016/5/13/chartex" xmlns:cx8="http://schemas.microsoft.com/office/drawing/2016/5/14/chartex" xmlns:mc="http://schemas.openxmlformats.org/markup-compatibility/2006" xmlns:aink="http://schemas.microsoft.com/office/drawing/2016/ink" xmlns:am3d="http://schemas.microsoft.com/office/drawing/2017/model3d" xmlns:o="urn:schemas-microsoft-com:office:office" xmlns:oel="http://schemas.microsoft.com/office/2019/extlst" xmlns:r="http://schemas.openxmlformats.org/officeDocument/2006/relationships" xmlns:m="http://schemas.openxmlformats.org/officeDocument/2006/math" xmlns:v="urn:schemas-microsoft-com:vml" xmlns:wp14="http://schemas.microsoft.com/office/word/2010/wordprocessingDrawing" xmlns:wp="http://schemas.openxmlformats.org/drawingml/2006/wordprocessingDrawing" xmlns:w10="urn:schemas-microsoft-com:office:word" xmlns:w="http://schemas.openxmlformats.org/wordprocessingml/2006/main" xmlns:w14="http://schemas.microsoft.com/office/word/2010/wordml" xmlns:w15="http://schemas.microsoft.com/office/word/2012/wordml" xmlns:w16cex="http://schemas.microsoft.com/office/word/2018/wordml/cex" xmlns:w16cid="http://schemas.microsoft.com/office/word/2016/wordml/cid" xmlns:w16="http://schemas.microsoft.com/office/word/2018/wordml" xmlns:w16du="http://schemas.microsoft.com/office/word/2023/wordml/word16du" xmlns:w16sdtdh="http://schemas.microsoft.com/office/word/2020/wordml/sdtdatahash" xmlns:w16se="http://schemas.microsoft.com/office/word/2015/wordml/symex" xmlns:wpg="http://schemas.microsoft.com/office/word/2010/wordprocessingGroup" xmlns:wpi="http://schemas.microsoft.com/office/word/2010/wordprocessingInk" xmlns:wne="http://schemas.microsoft.com/office/word/2006/wordml" xmlns:wps="http://schemas.microsoft.com/office/word/2010/wordprocessingShape" mc:Ignorable="w14 w15 w16se w16cid w16 w16cex w16sdtdh wp14">
+<w:numbering xmlns:wpc="http://schemas.microsoft.com/office/word/2010/wordprocessingCanvas" xmlns:cx="http://schemas.microsoft.com/office/drawing/2014/chartex" xmlns:cx1="http://schemas.microsoft.com/office/drawing/2015/9/8/chartex" xmlns:cx2="http://schemas.microsoft.com/office/drawing/2015/10/21/chartex" xmlns:cx3="http://schemas.microsoft.com/office/drawing/2016/5/9/chartex" xmlns:cx4="http://schemas.microsoft.com/office/drawing/2016/5/10/chartex" xmlns:cx5="http://schemas.microsoft.com/office/drawing/2016/5/11/chartex" xmlns:cx6="http://schemas.microsoft.com/office/drawing/2016/5/12/chartex" xmlns:cx7="http://schemas.microsoft.com/office/drawing/2016/5/13/chartex" xmlns:cx8="http://schemas.microsoft.com/office/drawing/2016/5/14/chartex" xmlns:mc="http://schemas.openxmlformats.org/markup-compatibility/2006" xmlns:aink="http://schemas.microsoft.com/office/drawing/2016/ink" xmlns:am3d="http://schemas.microsoft.com/office/drawing/2017/model3d" xmlns:o="urn:schemas-microsoft-com:office:office" xmlns:oel="http://schemas.microsoft.com/office/2019/extlst" xmlns:r="http://schemas.openxmlformats.org/officeDocument/2006/relationships" xmlns:m="http://schemas.openxmlformats.org/officeDocument/2006/math" xmlns:v="urn:schemas-microsoft-com:vml" xmlns:wp14="http://schemas.microsoft.com/office/word/2010/wordprocessingDrawing" xmlns:wp="http://schemas.openxmlformats.org/drawingml/2006/wordprocessingDrawing" xmlns:w10="urn:schemas-microsoft-com:office:word" xmlns:w="http://schemas.openxmlformats.org/wordprocessingml/2006/main" xmlns:w14="http://schemas.microsoft.com/office/word/2010/wordml" xmlns:w15="http://schemas.microsoft.com/office/word/2012/wordml" xmlns:w16cex="http://schemas.microsoft.com/office/word/2018/wordml/cex" xmlns:w16cid="http://schemas.microsoft.com/office/word/2016/wordml/cid" xmlns:w16="http://schemas.microsoft.com/office/word/2018/wordml" xmlns:w16du="http://schemas.microsoft.com/office/word/2023/wordml/word16du" xmlns:w16sdtdh="http://schemas.microsoft.com/office/word/2020/wordml/sdtdatahash" xmlns:w16sdtfl="http://schemas.microsoft.com/office/word/2024/wordml/sdtformatlock" xmlns:w16se="http://schemas.microsoft.com/office/word/2015/wordml/symex" xmlns:wpg="http://schemas.microsoft.com/office/word/2010/wordprocessingGroup" xmlns:wpi="http://schemas.microsoft.com/office/word/2010/wordprocessingInk" xmlns:wne="http://schemas.microsoft.com/office/word/2006/wordml" xmlns:wps="http://schemas.microsoft.com/office/word/2010/wordprocessingShape" mc:Ignorable="w14 w15 w16se w16cid w16 w16cex w16sdtdh w16sdtfl w16du wp14">
   <w:abstractNum w:abstractNumId="0" w15:restartNumberingAfterBreak="0">
     <w:nsid w:val="011828FA"/>
     <w:multiLevelType w:val="multilevel"/>
@@ -5156,7 +4896,7 @@
         <w:ind w:left="360" w:hanging="360"/>
       </w:pPr>
       <w:rPr>
-        <w:rFonts w:hint="default" w:eastAsia="Times New Roman"/>
+        <w:rFonts w:eastAsia="Times New Roman" w:hint="default"/>
         <w:color w:val="auto"/>
       </w:rPr>
     </w:lvl>
@@ -5169,7 +4909,7 @@
         <w:ind w:left="360" w:hanging="360"/>
       </w:pPr>
       <w:rPr>
-        <w:rFonts w:hint="default" w:eastAsia="Times New Roman"/>
+        <w:rFonts w:eastAsia="Times New Roman" w:hint="default"/>
         <w:color w:val="auto"/>
       </w:rPr>
     </w:lvl>
@@ -5182,7 +4922,7 @@
         <w:ind w:left="720" w:hanging="720"/>
       </w:pPr>
       <w:rPr>
-        <w:rFonts w:hint="default" w:eastAsia="Times New Roman"/>
+        <w:rFonts w:eastAsia="Times New Roman" w:hint="default"/>
         <w:color w:val="auto"/>
       </w:rPr>
     </w:lvl>
@@ -5195,7 +4935,7 @@
         <w:ind w:left="720" w:hanging="720"/>
       </w:pPr>
       <w:rPr>
-        <w:rFonts w:hint="default" w:eastAsia="Times New Roman"/>
+        <w:rFonts w:eastAsia="Times New Roman" w:hint="default"/>
         <w:color w:val="auto"/>
       </w:rPr>
     </w:lvl>
@@ -5208,7 +4948,7 @@
         <w:ind w:left="1080" w:hanging="1080"/>
       </w:pPr>
       <w:rPr>
-        <w:rFonts w:hint="default" w:eastAsia="Times New Roman"/>
+        <w:rFonts w:eastAsia="Times New Roman" w:hint="default"/>
         <w:color w:val="auto"/>
       </w:rPr>
     </w:lvl>
@@ -5221,7 +4961,7 @@
         <w:ind w:left="1080" w:hanging="1080"/>
       </w:pPr>
       <w:rPr>
-        <w:rFonts w:hint="default" w:eastAsia="Times New Roman"/>
+        <w:rFonts w:eastAsia="Times New Roman" w:hint="default"/>
         <w:color w:val="auto"/>
       </w:rPr>
     </w:lvl>
@@ -5234,7 +4974,7 @@
         <w:ind w:left="1440" w:hanging="1440"/>
       </w:pPr>
       <w:rPr>
-        <w:rFonts w:hint="default" w:eastAsia="Times New Roman"/>
+        <w:rFonts w:eastAsia="Times New Roman" w:hint="default"/>
         <w:color w:val="auto"/>
       </w:rPr>
     </w:lvl>
@@ -5247,7 +4987,7 @@
         <w:ind w:left="1440" w:hanging="1440"/>
       </w:pPr>
       <w:rPr>
-        <w:rFonts w:hint="default" w:eastAsia="Times New Roman"/>
+        <w:rFonts w:eastAsia="Times New Roman" w:hint="default"/>
         <w:color w:val="auto"/>
       </w:rPr>
     </w:lvl>
@@ -5260,7 +5000,7 @@
         <w:ind w:left="1800" w:hanging="1800"/>
       </w:pPr>
       <w:rPr>
-        <w:rFonts w:hint="default" w:eastAsia="Times New Roman"/>
+        <w:rFonts w:eastAsia="Times New Roman" w:hint="default"/>
         <w:color w:val="auto"/>
       </w:rPr>
     </w:lvl>
@@ -5278,7 +5018,7 @@
         <w:ind w:left="360" w:hanging="360"/>
       </w:pPr>
       <w:rPr>
-        <w:rFonts w:hint="default" w:eastAsiaTheme="minorHAnsi" w:cstheme="minorBidi"/>
+        <w:rFonts w:eastAsiaTheme="minorHAnsi" w:cstheme="minorBidi" w:hint="default"/>
         <w:sz w:val="24"/>
         <w:szCs w:val="28"/>
       </w:rPr>
@@ -5292,7 +5032,7 @@
         <w:ind w:left="720" w:hanging="720"/>
       </w:pPr>
       <w:rPr>
-        <w:rFonts w:hint="default" w:eastAsiaTheme="minorHAnsi" w:cstheme="minorBidi"/>
+        <w:rFonts w:eastAsiaTheme="minorHAnsi" w:cstheme="minorBidi" w:hint="default"/>
         <w:sz w:val="22"/>
       </w:rPr>
     </w:lvl>
@@ -5305,7 +5045,7 @@
         <w:ind w:left="720" w:hanging="720"/>
       </w:pPr>
       <w:rPr>
-        <w:rFonts w:hint="default" w:eastAsiaTheme="minorHAnsi" w:cstheme="minorBidi"/>
+        <w:rFonts w:eastAsiaTheme="minorHAnsi" w:cstheme="minorBidi" w:hint="default"/>
         <w:sz w:val="22"/>
       </w:rPr>
     </w:lvl>
@@ -5318,7 +5058,7 @@
         <w:ind w:left="1080" w:hanging="1080"/>
       </w:pPr>
       <w:rPr>
-        <w:rFonts w:hint="default" w:eastAsiaTheme="minorHAnsi" w:cstheme="minorBidi"/>
+        <w:rFonts w:eastAsiaTheme="minorHAnsi" w:cstheme="minorBidi" w:hint="default"/>
         <w:sz w:val="22"/>
       </w:rPr>
     </w:lvl>
@@ -5331,7 +5071,7 @@
         <w:ind w:left="1080" w:hanging="1080"/>
       </w:pPr>
       <w:rPr>
-        <w:rFonts w:hint="default" w:eastAsiaTheme="minorHAnsi" w:cstheme="minorBidi"/>
+        <w:rFonts w:eastAsiaTheme="minorHAnsi" w:cstheme="minorBidi" w:hint="default"/>
         <w:sz w:val="22"/>
       </w:rPr>
     </w:lvl>
@@ -5344,7 +5084,7 @@
         <w:ind w:left="1440" w:hanging="1440"/>
       </w:pPr>
       <w:rPr>
-        <w:rFonts w:hint="default" w:eastAsiaTheme="minorHAnsi" w:cstheme="minorBidi"/>
+        <w:rFonts w:eastAsiaTheme="minorHAnsi" w:cstheme="minorBidi" w:hint="default"/>
         <w:sz w:val="22"/>
       </w:rPr>
     </w:lvl>
@@ -5357,7 +5097,7 @@
         <w:ind w:left="1440" w:hanging="1440"/>
       </w:pPr>
       <w:rPr>
-        <w:rFonts w:hint="default" w:eastAsiaTheme="minorHAnsi" w:cstheme="minorBidi"/>
+        <w:rFonts w:eastAsiaTheme="minorHAnsi" w:cstheme="minorBidi" w:hint="default"/>
         <w:sz w:val="22"/>
       </w:rPr>
     </w:lvl>
@@ -5370,7 +5110,7 @@
         <w:ind w:left="1800" w:hanging="1800"/>
       </w:pPr>
       <w:rPr>
-        <w:rFonts w:hint="default" w:eastAsiaTheme="minorHAnsi" w:cstheme="minorBidi"/>
+        <w:rFonts w:eastAsiaTheme="minorHAnsi" w:cstheme="minorBidi" w:hint="default"/>
         <w:sz w:val="22"/>
       </w:rPr>
     </w:lvl>
@@ -5383,7 +5123,7 @@
         <w:ind w:left="1800" w:hanging="1800"/>
       </w:pPr>
       <w:rPr>
-        <w:rFonts w:hint="default" w:eastAsiaTheme="minorHAnsi" w:cstheme="minorBidi"/>
+        <w:rFonts w:eastAsiaTheme="minorHAnsi" w:cstheme="minorBidi" w:hint="default"/>
         <w:sz w:val="22"/>
       </w:rPr>
     </w:lvl>
@@ -5621,11 +5361,11 @@
 </file>
 
 <file path=word/styles.xml><?xml version="1.0" encoding="utf-8"?>
-<w:styles xmlns:wp14="http://schemas.microsoft.com/office/word/2010/wordprocessingDrawing" xmlns:mc="http://schemas.openxmlformats.org/markup-compatibility/2006" xmlns:r="http://schemas.openxmlformats.org/officeDocument/2006/relationships" xmlns:w="http://schemas.openxmlformats.org/wordprocessingml/2006/main" xmlns:w14="http://schemas.microsoft.com/office/word/2010/wordml" xmlns:w15="http://schemas.microsoft.com/office/word/2012/wordml" xmlns:w16cex="http://schemas.microsoft.com/office/word/2018/wordml/cex" xmlns:w16cid="http://schemas.microsoft.com/office/word/2016/wordml/cid" xmlns:w16="http://schemas.microsoft.com/office/word/2018/wordml" xmlns:w16sdtdh="http://schemas.microsoft.com/office/word/2020/wordml/sdtdatahash" xmlns:w16se="http://schemas.microsoft.com/office/word/2015/wordml/symex" mc:Ignorable="w14 w15 w16se w16cid w16 w16cex w16sdtdh wp14">
+<w:styles xmlns:mc="http://schemas.openxmlformats.org/markup-compatibility/2006" xmlns:r="http://schemas.openxmlformats.org/officeDocument/2006/relationships" xmlns:w="http://schemas.openxmlformats.org/wordprocessingml/2006/main" xmlns:w14="http://schemas.microsoft.com/office/word/2010/wordml" xmlns:w15="http://schemas.microsoft.com/office/word/2012/wordml" xmlns:w16cex="http://schemas.microsoft.com/office/word/2018/wordml/cex" xmlns:w16cid="http://schemas.microsoft.com/office/word/2016/wordml/cid" xmlns:w16="http://schemas.microsoft.com/office/word/2018/wordml" xmlns:w16du="http://schemas.microsoft.com/office/word/2023/wordml/word16du" xmlns:w16sdtdh="http://schemas.microsoft.com/office/word/2020/wordml/sdtdatahash" xmlns:w16sdtfl="http://schemas.microsoft.com/office/word/2024/wordml/sdtformatlock" xmlns:w16se="http://schemas.microsoft.com/office/word/2015/wordml/symex" mc:Ignorable="w14 w15 w16se w16cid w16 w16cex w16sdtdh w16sdtfl w16du">
   <w:docDefaults>
     <w:rPrDefault>
       <w:rPr>
-        <w:rFonts w:asciiTheme="minorHAnsi" w:hAnsiTheme="minorHAnsi" w:eastAsiaTheme="minorHAnsi" w:cstheme="minorBidi"/>
+        <w:rFonts w:asciiTheme="minorHAnsi" w:eastAsiaTheme="minorHAnsi" w:hAnsiTheme="minorHAnsi" w:cstheme="minorBidi"/>
         <w:sz w:val="22"/>
         <w:szCs w:val="22"/>
         <w:lang w:val="es-EC" w:eastAsia="en-US" w:bidi="ar-SA"/>
@@ -5640,14 +5380,14 @@
   <w:latentStyles w:defLockedState="0" w:defUIPriority="99" w:defSemiHidden="0" w:defUnhideWhenUsed="0" w:defQFormat="0" w:count="376">
     <w:lsdException w:name="Normal" w:uiPriority="0" w:qFormat="1"/>
     <w:lsdException w:name="heading 1" w:uiPriority="9" w:qFormat="1"/>
-    <w:lsdException w:name="heading 2" w:uiPriority="0" w:semiHidden="1" w:unhideWhenUsed="1" w:qFormat="1"/>
-    <w:lsdException w:name="heading 3" w:uiPriority="9" w:semiHidden="1" w:unhideWhenUsed="1" w:qFormat="1"/>
-    <w:lsdException w:name="heading 4" w:uiPriority="9" w:semiHidden="1" w:unhideWhenUsed="1" w:qFormat="1"/>
-    <w:lsdException w:name="heading 5" w:uiPriority="9" w:semiHidden="1" w:unhideWhenUsed="1" w:qFormat="1"/>
-    <w:lsdException w:name="heading 6" w:uiPriority="9" w:semiHidden="1" w:unhideWhenUsed="1" w:qFormat="1"/>
-    <w:lsdException w:name="heading 7" w:uiPriority="9" w:semiHidden="1" w:unhideWhenUsed="1" w:qFormat="1"/>
-    <w:lsdException w:name="heading 8" w:uiPriority="9" w:semiHidden="1" w:unhideWhenUsed="1" w:qFormat="1"/>
-    <w:lsdException w:name="heading 9" w:uiPriority="9" w:semiHidden="1" w:unhideWhenUsed="1" w:qFormat="1"/>
+    <w:lsdException w:name="heading 2" w:semiHidden="1" w:uiPriority="0" w:unhideWhenUsed="1" w:qFormat="1"/>
+    <w:lsdException w:name="heading 3" w:semiHidden="1" w:uiPriority="9" w:unhideWhenUsed="1" w:qFormat="1"/>
+    <w:lsdException w:name="heading 4" w:semiHidden="1" w:uiPriority="9" w:unhideWhenUsed="1" w:qFormat="1"/>
+    <w:lsdException w:name="heading 5" w:semiHidden="1" w:uiPriority="9" w:unhideWhenUsed="1" w:qFormat="1"/>
+    <w:lsdException w:name="heading 6" w:semiHidden="1" w:uiPriority="9" w:unhideWhenUsed="1" w:qFormat="1"/>
+    <w:lsdException w:name="heading 7" w:semiHidden="1" w:uiPriority="9" w:unhideWhenUsed="1" w:qFormat="1"/>
+    <w:lsdException w:name="heading 8" w:semiHidden="1" w:uiPriority="9" w:unhideWhenUsed="1" w:qFormat="1"/>
+    <w:lsdException w:name="heading 9" w:semiHidden="1" w:uiPriority="9" w:unhideWhenUsed="1" w:qFormat="1"/>
     <w:lsdException w:name="index 1" w:semiHidden="1" w:unhideWhenUsed="1"/>
     <w:lsdException w:name="index 2" w:semiHidden="1" w:unhideWhenUsed="1"/>
     <w:lsdException w:name="index 3" w:semiHidden="1" w:unhideWhenUsed="1"/>
@@ -5657,22 +5397,22 @@
     <w:lsdException w:name="index 7" w:semiHidden="1" w:unhideWhenUsed="1"/>
     <w:lsdException w:name="index 8" w:semiHidden="1" w:unhideWhenUsed="1"/>
     <w:lsdException w:name="index 9" w:semiHidden="1" w:unhideWhenUsed="1"/>
-    <w:lsdException w:name="toc 1" w:uiPriority="39" w:semiHidden="1" w:unhideWhenUsed="1"/>
-    <w:lsdException w:name="toc 2" w:uiPriority="39" w:semiHidden="1" w:unhideWhenUsed="1"/>
-    <w:lsdException w:name="toc 3" w:uiPriority="39" w:semiHidden="1" w:unhideWhenUsed="1"/>
-    <w:lsdException w:name="toc 4" w:uiPriority="39" w:semiHidden="1" w:unhideWhenUsed="1"/>
-    <w:lsdException w:name="toc 5" w:uiPriority="39" w:semiHidden="1" w:unhideWhenUsed="1"/>
-    <w:lsdException w:name="toc 6" w:uiPriority="39" w:semiHidden="1" w:unhideWhenUsed="1"/>
-    <w:lsdException w:name="toc 7" w:uiPriority="39" w:semiHidden="1" w:unhideWhenUsed="1"/>
-    <w:lsdException w:name="toc 8" w:uiPriority="39" w:semiHidden="1" w:unhideWhenUsed="1"/>
-    <w:lsdException w:name="toc 9" w:uiPriority="39" w:semiHidden="1" w:unhideWhenUsed="1"/>
+    <w:lsdException w:name="toc 1" w:semiHidden="1" w:uiPriority="39" w:unhideWhenUsed="1"/>
+    <w:lsdException w:name="toc 2" w:semiHidden="1" w:uiPriority="39" w:unhideWhenUsed="1"/>
+    <w:lsdException w:name="toc 3" w:semiHidden="1" w:uiPriority="39" w:unhideWhenUsed="1"/>
+    <w:lsdException w:name="toc 4" w:semiHidden="1" w:uiPriority="39" w:unhideWhenUsed="1"/>
+    <w:lsdException w:name="toc 5" w:semiHidden="1" w:uiPriority="39" w:unhideWhenUsed="1"/>
+    <w:lsdException w:name="toc 6" w:semiHidden="1" w:uiPriority="39" w:unhideWhenUsed="1"/>
+    <w:lsdException w:name="toc 7" w:semiHidden="1" w:uiPriority="39" w:unhideWhenUsed="1"/>
+    <w:lsdException w:name="toc 8" w:semiHidden="1" w:uiPriority="39" w:unhideWhenUsed="1"/>
+    <w:lsdException w:name="toc 9" w:semiHidden="1" w:uiPriority="39" w:unhideWhenUsed="1"/>
     <w:lsdException w:name="Normal Indent" w:semiHidden="1" w:unhideWhenUsed="1"/>
     <w:lsdException w:name="footnote text" w:semiHidden="1" w:unhideWhenUsed="1"/>
     <w:lsdException w:name="annotation text" w:semiHidden="1" w:unhideWhenUsed="1"/>
     <w:lsdException w:name="header" w:semiHidden="1" w:unhideWhenUsed="1"/>
     <w:lsdException w:name="footer" w:semiHidden="1" w:unhideWhenUsed="1"/>
     <w:lsdException w:name="index heading" w:semiHidden="1" w:unhideWhenUsed="1"/>
-    <w:lsdException w:name="caption" w:uiPriority="35" w:semiHidden="1" w:unhideWhenUsed="1" w:qFormat="1"/>
+    <w:lsdException w:name="caption" w:semiHidden="1" w:uiPriority="35" w:unhideWhenUsed="1" w:qFormat="1"/>
     <w:lsdException w:name="table of figures" w:semiHidden="1" w:unhideWhenUsed="1"/>
     <w:lsdException w:name="envelope address" w:semiHidden="1" w:unhideWhenUsed="1"/>
     <w:lsdException w:name="envelope return" w:semiHidden="1" w:unhideWhenUsed="1"/>
@@ -5703,7 +5443,7 @@
     <w:lsdException w:name="Title" w:uiPriority="10" w:qFormat="1"/>
     <w:lsdException w:name="Closing" w:semiHidden="1" w:unhideWhenUsed="1"/>
     <w:lsdException w:name="Signature" w:semiHidden="1" w:unhideWhenUsed="1"/>
-    <w:lsdException w:name="Default Paragraph Font" w:uiPriority="1" w:semiHidden="1" w:unhideWhenUsed="1"/>
+    <w:lsdException w:name="Default Paragraph Font" w:semiHidden="1" w:uiPriority="1" w:unhideWhenUsed="1"/>
     <w:lsdException w:name="Body Text" w:semiHidden="1" w:unhideWhenUsed="1"/>
     <w:lsdException w:name="Body Text Indent" w:semiHidden="1" w:unhideWhenUsed="1"/>
     <w:lsdException w:name="List Continue" w:semiHidden="1" w:unhideWhenUsed="1"/>
@@ -5903,8 +5643,8 @@
     <w:lsdException w:name="Subtle Reference" w:uiPriority="31" w:qFormat="1"/>
     <w:lsdException w:name="Intense Reference" w:uiPriority="32" w:qFormat="1"/>
     <w:lsdException w:name="Book Title" w:uiPriority="33" w:qFormat="1"/>
-    <w:lsdException w:name="Bibliography" w:uiPriority="37" w:semiHidden="1" w:unhideWhenUsed="1"/>
-    <w:lsdException w:name="TOC Heading" w:uiPriority="39" w:semiHidden="1" w:unhideWhenUsed="1" w:qFormat="1"/>
+    <w:lsdException w:name="Bibliography" w:semiHidden="1" w:uiPriority="37" w:unhideWhenUsed="1"/>
+    <w:lsdException w:name="TOC Heading" w:semiHidden="1" w:uiPriority="39" w:unhideWhenUsed="1" w:qFormat="1"/>
     <w:lsdException w:name="Plain Table 1" w:uiPriority="41"/>
     <w:lsdException w:name="Plain Table 2" w:uiPriority="42"/>
     <w:lsdException w:name="Plain Table 3" w:uiPriority="43"/>
@@ -6015,7 +5755,7 @@
     <w:lsdException w:name="Unresolved Mention" w:semiHidden="1" w:unhideWhenUsed="1"/>
     <w:lsdException w:name="Smart Link" w:semiHidden="1" w:unhideWhenUsed="1"/>
   </w:latentStyles>
-  <w:style w:type="paragraph" w:styleId="Normal" w:default="1">
+  <w:style w:type="paragraph" w:default="1" w:styleId="Normal">
     <w:name w:val="Normal"/>
     <w:qFormat/>
     <w:rsid w:val="00A814E7"/>
@@ -6036,7 +5776,7 @@
       <w:outlineLvl w:val="1"/>
     </w:pPr>
     <w:rPr>
-      <w:rFonts w:ascii="Arial" w:hAnsi="Arial" w:eastAsia="Times New Roman" w:cs="Arial"/>
+      <w:rFonts w:ascii="Arial" w:eastAsia="Times New Roman" w:hAnsi="Arial" w:cs="Arial"/>
       <w:b/>
       <w:bCs/>
       <w:sz w:val="24"/>
@@ -6044,13 +5784,13 @@
       <w:lang w:val="es-MX" w:eastAsia="es-ES"/>
     </w:rPr>
   </w:style>
-  <w:style w:type="character" w:styleId="Fuentedeprrafopredeter" w:default="1">
+  <w:style w:type="character" w:default="1" w:styleId="Fuentedeprrafopredeter">
     <w:name w:val="Default Paragraph Font"/>
     <w:uiPriority w:val="1"/>
     <w:semiHidden/>
     <w:unhideWhenUsed/>
   </w:style>
-  <w:style w:type="table" w:styleId="Tablanormal" w:default="1">
+  <w:style w:type="table" w:default="1" w:styleId="Tablanormal">
     <w:name w:val="Normal Table"/>
     <w:uiPriority w:val="99"/>
     <w:semiHidden/>
@@ -6065,7 +5805,7 @@
       </w:tblCellMar>
     </w:tblPr>
   </w:style>
-  <w:style w:type="numbering" w:styleId="Sinlista" w:default="1">
+  <w:style w:type="numbering" w:default="1" w:styleId="Sinlista">
     <w:name w:val="No List"/>
     <w:uiPriority w:val="99"/>
     <w:semiHidden/>
@@ -6081,12 +5821,12 @@
     </w:pPr>
     <w:tblPr>
       <w:tblBorders>
-        <w:top w:val="single" w:color="auto" w:sz="4" w:space="0"/>
-        <w:left w:val="single" w:color="auto" w:sz="4" w:space="0"/>
-        <w:bottom w:val="single" w:color="auto" w:sz="4" w:space="0"/>
-        <w:right w:val="single" w:color="auto" w:sz="4" w:space="0"/>
-        <w:insideH w:val="single" w:color="auto" w:sz="4" w:space="0"/>
-        <w:insideV w:val="single" w:color="auto" w:sz="4" w:space="0"/>
+        <w:top w:val="single" w:sz="4" w:space="0" w:color="auto"/>
+        <w:left w:val="single" w:sz="4" w:space="0" w:color="auto"/>
+        <w:bottom w:val="single" w:sz="4" w:space="0" w:color="auto"/>
+        <w:right w:val="single" w:sz="4" w:space="0" w:color="auto"/>
+        <w:insideH w:val="single" w:sz="4" w:space="0" w:color="auto"/>
+        <w:insideV w:val="single" w:sz="4" w:space="0" w:color="auto"/>
       </w:tblBorders>
     </w:tblPr>
   </w:style>
@@ -6116,7 +5856,7 @@
       <w:spacing w:after="0" w:line="240" w:lineRule="auto"/>
     </w:pPr>
   </w:style>
-  <w:style w:type="character" w:styleId="EncabezadoCar" w:customStyle="1">
+  <w:style w:type="character" w:customStyle="1" w:styleId="EncabezadoCar">
     <w:name w:val="Encabezado Car"/>
     <w:basedOn w:val="Fuentedeprrafopredeter"/>
     <w:link w:val="Encabezado"/>
@@ -6138,7 +5878,7 @@
       <w:spacing w:after="0" w:line="240" w:lineRule="auto"/>
     </w:pPr>
   </w:style>
-  <w:style w:type="character" w:styleId="PiedepginaCar" w:customStyle="1">
+  <w:style w:type="character" w:customStyle="1" w:styleId="PiedepginaCar">
     <w:name w:val="Pie de página Car"/>
     <w:basedOn w:val="Fuentedeprrafopredeter"/>
     <w:link w:val="Piedepgina"/>
@@ -6162,7 +5902,7 @@
       <w:szCs w:val="16"/>
     </w:rPr>
   </w:style>
-  <w:style w:type="character" w:styleId="TextodegloboCar" w:customStyle="1">
+  <w:style w:type="character" w:customStyle="1" w:styleId="TextodegloboCar">
     <w:name w:val="Texto de globo Car"/>
     <w:basedOn w:val="Fuentedeprrafopredeter"/>
     <w:link w:val="Textodeglobo"/>
@@ -6175,14 +5915,14 @@
       <w:szCs w:val="16"/>
     </w:rPr>
   </w:style>
-  <w:style w:type="character" w:styleId="Ttulo2Car" w:customStyle="1">
+  <w:style w:type="character" w:customStyle="1" w:styleId="Ttulo2Car">
     <w:name w:val="Título 2 Car"/>
     <w:basedOn w:val="Fuentedeprrafopredeter"/>
     <w:link w:val="Ttulo2"/>
     <w:semiHidden/>
     <w:rsid w:val="00732AF9"/>
     <w:rPr>
-      <w:rFonts w:ascii="Arial" w:hAnsi="Arial" w:eastAsia="Times New Roman" w:cs="Arial"/>
+      <w:rFonts w:ascii="Arial" w:eastAsia="Times New Roman" w:hAnsi="Arial" w:cs="Arial"/>
       <w:b/>
       <w:bCs/>
       <w:sz w:val="24"/>
@@ -6479,25 +6219,6 @@
 </file>
 
 <file path=customXml/item1.xml><?xml version="1.0" encoding="utf-8"?>
-<p:properties xmlns:p="http://schemas.microsoft.com/office/2006/metadata/properties" xmlns:xsi="http://www.w3.org/2001/XMLSchema-instance" xmlns:pc="http://schemas.microsoft.com/office/infopath/2007/PartnerControls">
-  <documentManagement/>
-</p:properties>
-</file>
-
-<file path=customXml/item2.xml><?xml version="1.0" encoding="utf-8"?>
-<b:Sources xmlns:b="http://schemas.openxmlformats.org/officeDocument/2006/bibliography" xmlns="http://schemas.openxmlformats.org/officeDocument/2006/bibliography" SelectedStyle="\APA.XSL" StyleName="APA"/>
-</file>
-
-<file path=customXml/item3.xml><?xml version="1.0" encoding="utf-8"?>
-<?mso-contentType ?>
-<FormTemplates xmlns="http://schemas.microsoft.com/sharepoint/v3/contenttype/forms">
-  <Display>DocumentLibraryForm</Display>
-  <Edit>DocumentLibraryForm</Edit>
-  <New>DocumentLibraryForm</New>
-</FormTemplates>
-</file>
-
-<file path=customXml/item4.xml><?xml version="1.0" encoding="utf-8"?>
 <ct:contentTypeSchema xmlns:ct="http://schemas.microsoft.com/office/2006/metadata/contentType" xmlns:ma="http://schemas.microsoft.com/office/2006/metadata/properties/metaAttributes" ct:_="" ma:_="" ma:contentTypeName="Documento" ma:contentTypeID="0x010100008F025A5B414E47AB4CA2CF984DC385" ma:contentTypeVersion="6" ma:contentTypeDescription="Crear nuevo documento." ma:contentTypeScope="" ma:versionID="e098c3e442665619dd91d7280aaf523f">
   <xsd:schema xmlns:xsd="http://www.w3.org/2001/XMLSchema" xmlns:xs="http://www.w3.org/2001/XMLSchema" xmlns:p="http://schemas.microsoft.com/office/2006/metadata/properties" xmlns:ns2="9af0b974-c6a6-4e1a-a5f7-bfc85f0cc285" xmlns:ns3="cab2410f-190c-4dc3-ac09-a16b3f29b5fe" targetNamespace="http://schemas.microsoft.com/office/2006/metadata/properties" ma:root="true" ma:fieldsID="26319a3a72437049db46ab2bf9ed165c" ns2:_="" ns3:_="">
     <xsd:import namespace="9af0b974-c6a6-4e1a-a5f7-bfc85f0cc285"/>
@@ -6674,24 +6395,53 @@
 </ct:contentTypeSchema>
 </file>
 
+<file path=customXml/item2.xml><?xml version="1.0" encoding="utf-8"?>
+<?mso-contentType ?>
+<FormTemplates xmlns="http://schemas.microsoft.com/sharepoint/v3/contenttype/forms">
+  <Display>DocumentLibraryForm</Display>
+  <Edit>DocumentLibraryForm</Edit>
+  <New>DocumentLibraryForm</New>
+</FormTemplates>
+</file>
+
+<file path=customXml/item3.xml><?xml version="1.0" encoding="utf-8"?>
+<b:Sources xmlns:b="http://schemas.openxmlformats.org/officeDocument/2006/bibliography" xmlns="http://schemas.openxmlformats.org/officeDocument/2006/bibliography" SelectedStyle="\APA.XSL" StyleName="APA"/>
+</file>
+
+<file path=customXml/item4.xml><?xml version="1.0" encoding="utf-8"?>
+<p:properties xmlns:p="http://schemas.microsoft.com/office/2006/metadata/properties" xmlns:xsi="http://www.w3.org/2001/XMLSchema-instance" xmlns:pc="http://schemas.microsoft.com/office/infopath/2007/PartnerControls">
+  <documentManagement/>
+</p:properties>
+</file>
+
 <file path=customXml/itemProps1.xml><?xml version="1.0" encoding="utf-8"?>
-<ds:datastoreItem xmlns:ds="http://schemas.openxmlformats.org/officeDocument/2006/customXml" ds:itemID="{DE981C44-F527-4E3F-A0D4-4C0EE22A7EB5}">
+<ds:datastoreItem xmlns:ds="http://schemas.openxmlformats.org/officeDocument/2006/customXml" ds:itemID="{0F4F107C-AB20-4360-AB43-446D8D150A06}">
   <ds:schemaRefs>
+    <ds:schemaRef ds:uri="http://schemas.microsoft.com/office/2006/metadata/contentType"/>
+    <ds:schemaRef ds:uri="http://schemas.microsoft.com/office/2006/metadata/properties/metaAttributes"/>
+    <ds:schemaRef ds:uri="http://www.w3.org/2001/XMLSchema"/>
+    <ds:schemaRef ds:uri="http://schemas.microsoft.com/office/2006/metadata/properties"/>
+    <ds:schemaRef ds:uri="9af0b974-c6a6-4e1a-a5f7-bfc85f0cc285"/>
+    <ds:schemaRef ds:uri="cab2410f-190c-4dc3-ac09-a16b3f29b5fe"/>
+    <ds:schemaRef ds:uri="http://schemas.microsoft.com/office/2006/documentManagement/types"/>
+    <ds:schemaRef ds:uri="http://schemas.microsoft.com/office/infopath/2007/PartnerControls"/>
+    <ds:schemaRef ds:uri="http://schemas.openxmlformats.org/package/2006/metadata/core-properties"/>
     <ds:schemaRef ds:uri="http://purl.org/dc/elements/1.1/"/>
-    <ds:schemaRef ds:uri="http://purl.org/dc/dcmitype/"/>
-    <ds:schemaRef ds:uri="cab2410f-190c-4dc3-ac09-a16b3f29b5fe"/>
-    <ds:schemaRef ds:uri="http://schemas.microsoft.com/office/2006/metadata/properties"/>
-    <ds:schemaRef ds:uri="http://schemas.microsoft.com/office/2006/documentManagement/types"/>
     <ds:schemaRef ds:uri="http://purl.org/dc/terms/"/>
-    <ds:schemaRef ds:uri="http://schemas.openxmlformats.org/package/2006/metadata/core-properties"/>
-    <ds:schemaRef ds:uri="http://schemas.microsoft.com/office/infopath/2007/PartnerControls"/>
-    <ds:schemaRef ds:uri="9af0b974-c6a6-4e1a-a5f7-bfc85f0cc285"/>
-    <ds:schemaRef ds:uri="http://www.w3.org/XML/1998/namespace"/>
+    <ds:schemaRef ds:uri="http://schemas.microsoft.com/internal/obd"/>
   </ds:schemaRefs>
 </ds:datastoreItem>
 </file>
 
 <file path=customXml/itemProps2.xml><?xml version="1.0" encoding="utf-8"?>
+<ds:datastoreItem xmlns:ds="http://schemas.openxmlformats.org/officeDocument/2006/customXml" ds:itemID="{86C3B59E-3047-432C-BD2E-F4EADEBF1DB1}">
+  <ds:schemaRefs>
+    <ds:schemaRef ds:uri="http://schemas.microsoft.com/sharepoint/v3/contenttype/forms"/>
+  </ds:schemaRefs>
+</ds:datastoreItem>
+</file>
+
+<file path=customXml/itemProps3.xml><?xml version="1.0" encoding="utf-8"?>
 <ds:datastoreItem xmlns:ds="http://schemas.openxmlformats.org/officeDocument/2006/customXml" ds:itemID="{A32D7226-8037-4ACB-9624-F3561E2BA6F1}">
   <ds:schemaRefs>
     <ds:schemaRef ds:uri="http://schemas.openxmlformats.org/officeDocument/2006/bibliography"/>
@@ -6699,14 +6449,11 @@
 </ds:datastoreItem>
 </file>
 
-<file path=customXml/itemProps3.xml><?xml version="1.0" encoding="utf-8"?>
-<ds:datastoreItem xmlns:ds="http://schemas.openxmlformats.org/officeDocument/2006/customXml" ds:itemID="{86C3B59E-3047-432C-BD2E-F4EADEBF1DB1}">
+<file path=customXml/itemProps4.xml><?xml version="1.0" encoding="utf-8"?>
+<ds:datastoreItem xmlns:ds="http://schemas.openxmlformats.org/officeDocument/2006/customXml" ds:itemID="{DE981C44-F527-4E3F-A0D4-4C0EE22A7EB5}">
   <ds:schemaRefs>
-    <ds:schemaRef ds:uri="http://schemas.microsoft.com/sharepoint/v3/contenttype/forms"/>
+    <ds:schemaRef ds:uri="http://schemas.microsoft.com/office/2006/metadata/properties"/>
+    <ds:schemaRef ds:uri="http://schemas.microsoft.com/office/infopath/2007/PartnerControls"/>
   </ds:schemaRefs>
 </ds:datastoreItem>
-</file>
-
-<file path=customXml/itemProps4.xml><?xml version="1.0" encoding="utf-8"?>
-<ds:datastoreItem xmlns:ds="http://schemas.openxmlformats.org/officeDocument/2006/customXml" ds:itemID="{0F4F107C-AB20-4360-AB43-446D8D150A06}"/>
 </file>
</xml_diff>